<commit_message>
Fix Physics Actually Volume 1 Kindle masters
</commit_message>
<xml_diff>
--- a/Physics, Actually - SERIES/Volume 1/Physics Vol 1 - Motion, Forces, Time, and Relativity (KDP UPLOAD - KINDLE EBOOK).docx
+++ b/Physics, Actually - SERIES/Volume 1/Physics Vol 1 - Motion, Forces, Time, and Relativity (KDP UPLOAD - KINDLE EBOOK).docx
@@ -648,6 +648,7 @@
     <w:p>
       <w:pPr>
         <w:pStyle w:val="Heading1"/>
+        <w:jc w:val="center"/>
       </w:pPr>
       <w:bookmarkStart w:id="140" w:name="_TocAll0001"/>
       <w:bookmarkEnd w:id="140"/>
@@ -712,7 +713,12 @@
       </w:pPr>
       <w:r>
         <w:rPr>
+          <w:rFonts w:ascii="Amazon Ember" w:hAnsi="Amazon Ember" w:cs="Amazon Ember" w:eastAsia="Amazon Ember"/>
           <w:b/>
+          <w:bCs/>
+          <w:color w:val="0000FF"/>
+          <w:sz w:val="36"/>
+          <w:szCs w:val="36"/>
         </w:rPr>
         <w:t xml:space="preserve">Prologue</w:t>
       </w:r>
@@ -720,6 +726,7 @@
     <w:p>
       <w:pPr>
         <w:pStyle w:val="Heading1"/>
+        <w:jc w:val="center"/>
       </w:pPr>
       <w:bookmarkStart w:id="1145" w:name="chPROLOGUE"/>
       <w:bookmarkEnd w:id="1145"/>
@@ -729,7 +736,50 @@
     </w:p>
     <w:p>
       <w:pPr>
-        <w:pStyle w:val="Heading2"/>
+        <w:keepLines/>
+        <w:spacing w:before="0" w:after="0"/>
+        <w:jc w:val="center"/>
+      </w:pPr>
+      <w:r>
+        <w:drawing>
+          <wp:inline xmlns:a="http://schemas.openxmlformats.org/drawingml/2006/main" xmlns:pic="http://schemas.openxmlformats.org/drawingml/2006/picture">
+            <wp:extent cx="3145536" cy="4718304"/>
+            <wp:docPr id="507175841" name="PrologueOpeningCard" descr="Prologue opener: Newton and Maxwell connect familiar phenomena with a larger picture of physics."/>
+            <wp:cNvGraphicFramePr>
+              <a:graphicFrameLocks noChangeAspect="1"/>
+            </wp:cNvGraphicFramePr>
+            <a:graphic>
+              <a:graphicData uri="http://schemas.openxmlformats.org/drawingml/2006/picture">
+                <pic:pic>
+                  <pic:nvPicPr>
+                    <pic:cNvPr id="0" name="Prologue-opening-card.jpg"/>
+                    <pic:cNvPicPr/>
+                  </pic:nvPicPr>
+                  <pic:blipFill>
+                    <a:blip r:embed="rId27"/>
+                    <a:stretch>
+                      <a:fillRect/>
+                    </a:stretch>
+                  </pic:blipFill>
+                  <pic:spPr>
+                    <a:xfrm>
+                      <a:off x="0" y="0"/>
+                      <a:ext cx="3145536" cy="4718304"/>
+                    </a:xfrm>
+                    <a:prstGeom prst="rect"/>
+                  </pic:spPr>
+                </pic:pic>
+              </a:graphicData>
+            </a:graphic>
+          </wp:inline>
+        </w:drawing>
+      </w:r>
+    </w:p>
+    <w:p>
+      <w:pPr>
+        <w:pStyle w:val="Heading2"/>
+        <w:pageBreakBefore/>
+        <w:jc w:val="center"/>
       </w:pPr>
       <w:r>
         <w:t>Before the Universe Became Weird</w:t>
@@ -770,6 +820,7 @@
     <w:p>
       <w:pPr>
         <w:pStyle w:val="Heading2"/>
+        <w:jc w:val="center"/>
       </w:pPr>
       <w:r>
         <w:t>Newton’s Apple Has Been Given Too Much Credit</w:t>
@@ -803,6 +854,7 @@
     <w:p>
       <w:pPr>
         <w:pStyle w:val="Heading2"/>
+        <w:jc w:val="center"/>
       </w:pPr>
       <w:r>
         <w:t>The Universe Becomes a Machine</w:t>
@@ -835,6 +887,7 @@
     <w:p>
       <w:pPr>
         <w:pStyle w:val="Heading2"/>
+        <w:jc w:val="center"/>
       </w:pPr>
       <w:r>
         <w:t>Time Was Absolute — Or So It Seemed</w:t>
@@ -867,6 +920,7 @@
     <w:p>
       <w:pPr>
         <w:pStyle w:val="Heading2"/>
+        <w:jc w:val="center"/>
       </w:pPr>
       <w:r>
         <w:t>Then There Was Electricity</w:t>
@@ -891,6 +945,7 @@
     <w:p>
       <w:pPr>
         <w:pStyle w:val="Heading2"/>
+        <w:jc w:val="center"/>
       </w:pPr>
       <w:r>
         <w:lastRenderedPageBreak/>
@@ -925,6 +980,7 @@
     <w:p>
       <w:pPr>
         <w:pStyle w:val="Heading2"/>
+        <w:jc w:val="center"/>
       </w:pPr>
       <w:r>
         <w:t>The Speed of the Wave</w:t>
@@ -957,6 +1013,7 @@
     <w:p>
       <w:pPr>
         <w:pStyle w:val="Heading2"/>
+        <w:jc w:val="center"/>
       </w:pPr>
       <w:r>
         <w:t>The Trouble With Maxwell</w:t>
@@ -989,6 +1046,7 @@
     <w:p>
       <w:pPr>
         <w:pStyle w:val="Heading2"/>
+        <w:jc w:val="center"/>
       </w:pPr>
       <w:r>
         <w:t>Einstein Walks Through the Door</w:t>
@@ -1029,6 +1087,7 @@
     <w:p>
       <w:pPr>
         <w:pStyle w:val="Heading2"/>
+        <w:jc w:val="center"/>
       </w:pPr>
       <w:r>
         <w:t>From Newton to Maxwell to Einstein</w:t>
@@ -1069,6 +1128,7 @@
     <w:p>
       <w:pPr>
         <w:pStyle w:val="Heading2"/>
+        <w:jc w:val="center"/>
       </w:pPr>
       <w:r>
         <w:t>One Last Look Back</w:t>
@@ -1101,6 +1161,7 @@
     <w:p>
       <w:pPr>
         <w:pStyle w:val="Heading2"/>
+        <w:jc w:val="center"/>
       </w:pPr>
       <w:r>
         <w:lastRenderedPageBreak/>
@@ -1168,6 +1229,7 @@
     <w:p>
       <w:pPr>
         <w:pStyle w:val="Heading1"/>
+        <w:jc w:val="center"/>
       </w:pPr>
       <w:bookmarkStart w:id="1146" w:name="part1"/>
       <w:bookmarkEnd w:id="1146"/>
@@ -1199,7 +1261,12 @@
       </w:pPr>
       <w:r>
         <w:rPr>
+          <w:rFonts w:ascii="Amazon Ember" w:hAnsi="Amazon Ember" w:cs="Amazon Ember" w:eastAsia="Amazon Ember"/>
           <w:b/>
+          <w:bCs/>
+          <w:color w:val="0000FF"/>
+          <w:sz w:val="36"/>
+          <w:szCs w:val="36"/>
         </w:rPr>
         <w:t xml:space="preserve">Chapter 1</w:t>
       </w:r>
@@ -1207,6 +1274,7 @@
     <w:p>
       <w:pPr>
         <w:pStyle w:val="Heading1"/>
+        <w:jc w:val="center"/>
       </w:pPr>
       <w:bookmarkStart w:id="1147" w:name="ch01"/>
       <w:bookmarkEnd w:id="1147"/>
@@ -1297,6 +1365,7 @@
     <w:p>
       <w:pPr>
         <w:pStyle w:val="Heading2"/>
+        <w:jc w:val="center"/>
       </w:pPr>
       <w:r>
         <w:t>The universe does not look like a physics textbook</w:t>
@@ -1355,6 +1424,7 @@
     <w:p>
       <w:pPr>
         <w:pStyle w:val="Heading2"/>
+        <w:jc w:val="center"/>
       </w:pPr>
       <w:r>
         <w:t>A strange business called “observation”</w:t>
@@ -1407,6 +1477,7 @@
     <w:p>
       <w:pPr>
         <w:pStyle w:val="Heading2"/>
+        <w:jc w:val="center"/>
       </w:pPr>
       <w:r>
         <w:t>Nature gets the final vote</w:t>
@@ -1459,6 +1530,7 @@
     <w:p>
       <w:pPr>
         <w:pStyle w:val="Heading2"/>
+        <w:jc w:val="center"/>
       </w:pPr>
       <w:r>
         <w:t>The advantage of being confused</w:t>
@@ -1508,6 +1580,7 @@
     <w:p>
       <w:pPr>
         <w:pStyle w:val="Heading2"/>
+        <w:jc w:val="center"/>
       </w:pPr>
       <w:r>
         <w:t>A universe full of invisible things</w:t>
@@ -1540,6 +1613,7 @@
     <w:p>
       <w:pPr>
         <w:pStyle w:val="Heading2"/>
+        <w:jc w:val="center"/>
       </w:pPr>
       <w:r>
         <w:lastRenderedPageBreak/>
@@ -1597,6 +1671,7 @@
     <w:p>
       <w:pPr>
         <w:pStyle w:val="Heading2"/>
+        <w:jc w:val="center"/>
       </w:pPr>
       <w:r>
         <w:t>The world is not made of equations</w:t>
@@ -1638,6 +1713,7 @@
     <w:p>
       <w:pPr>
         <w:pStyle w:val="Heading2"/>
+        <w:jc w:val="center"/>
       </w:pPr>
       <w:r>
         <w:t>Why bother learning physics?</w:t>
@@ -1690,6 +1766,7 @@
     <w:p>
       <w:pPr>
         <w:pStyle w:val="Heading2"/>
+        <w:jc w:val="center"/>
       </w:pPr>
       <w:r>
         <w:t>One final experiment</w:t>
@@ -1766,6 +1843,7 @@
     <w:p>
       <w:pPr>
         <w:pStyle w:val="Heading2"/>
+        <w:jc w:val="center"/>
       </w:pPr>
       <w:bookmarkStart w:id="1168" w:name="ex_ch1"/>
       <w:bookmarkEnd w:id="1168"/>
@@ -1870,6 +1948,7 @@
     <w:p>
       <w:pPr>
         <w:pStyle w:val="Heading1"/>
+        <w:jc w:val="center"/>
       </w:pPr>
       <w:bookmarkStart w:id="1148" w:name="part2"/>
       <w:bookmarkEnd w:id="1148"/>
@@ -1901,7 +1980,12 @@
       </w:pPr>
       <w:r>
         <w:rPr>
+          <w:rFonts w:ascii="Amazon Ember" w:hAnsi="Amazon Ember" w:cs="Amazon Ember" w:eastAsia="Amazon Ember"/>
           <w:b/>
+          <w:bCs/>
+          <w:color w:val="0000FF"/>
+          <w:sz w:val="36"/>
+          <w:szCs w:val="36"/>
         </w:rPr>
         <w:t xml:space="preserve">Chapter 2</w:t>
       </w:r>
@@ -1909,6 +1993,7 @@
     <w:p>
       <w:pPr>
         <w:pStyle w:val="Heading1"/>
+        <w:jc w:val="center"/>
       </w:pPr>
       <w:bookmarkStart w:id="1149" w:name="ch02"/>
       <w:bookmarkEnd w:id="1149"/>
@@ -1983,6 +2068,7 @@
     <w:p>
       <w:pPr>
         <w:pStyle w:val="Heading2"/>
+        <w:jc w:val="center"/>
       </w:pPr>
       <w:r>
         <w:t>The universe has no “still” sign</w:t>
@@ -2031,6 +2117,7 @@
     <w:p>
       <w:pPr>
         <w:pStyle w:val="Heading2"/>
+        <w:jc w:val="center"/>
       </w:pPr>
       <w:r>
         <w:lastRenderedPageBreak/>
@@ -2056,6 +2143,7 @@
     <w:p>
       <w:pPr>
         <w:pStyle w:val="Heading2"/>
+        <w:jc w:val="center"/>
       </w:pPr>
       <w:r>
         <w:t>Speed: how fast is fast?</w:t>
@@ -2131,6 +2219,7 @@
     <w:p>
       <w:pPr>
         <w:pStyle w:val="Heading2"/>
+        <w:jc w:val="center"/>
       </w:pPr>
       <w:r>
         <w:t>Speedometers are surprisingly unhelpful</w:t>
@@ -2163,6 +2252,7 @@
     <w:p>
       <w:pPr>
         <w:pStyle w:val="Heading2"/>
+        <w:jc w:val="center"/>
       </w:pPr>
       <w:r>
         <w:t>Speed is not velocity</w:t>
@@ -2204,6 +2294,7 @@
     <w:p>
       <w:pPr>
         <w:pStyle w:val="Heading2"/>
+        <w:jc w:val="center"/>
       </w:pPr>
       <w:r>
         <w:t>Acceleration is not what most people think</w:t>
@@ -2252,6 +2343,7 @@
     <w:p>
       <w:pPr>
         <w:pStyle w:val="Heading2"/>
+        <w:jc w:val="center"/>
       </w:pPr>
       <w:r>
         <w:lastRenderedPageBreak/>
@@ -2293,6 +2385,7 @@
     <w:p>
       <w:pPr>
         <w:pStyle w:val="Heading2"/>
+        <w:jc w:val="center"/>
       </w:pPr>
       <w:r>
         <w:t>The experiment you can perform without leaving your chair</w:t>
@@ -2337,6 +2430,7 @@
     <w:p>
       <w:pPr>
         <w:pStyle w:val="Heading2"/>
+        <w:jc w:val="center"/>
       </w:pPr>
       <w:r>
         <w:t>The universe has no preferred couch</w:t>
@@ -2369,6 +2463,7 @@
     <w:p>
       <w:pPr>
         <w:pStyle w:val="Heading2"/>
+        <w:jc w:val="center"/>
       </w:pPr>
       <w:r>
         <w:t>A universe where change matters</w:t>
@@ -2413,6 +2508,7 @@
     <w:p>
       <w:pPr>
         <w:pStyle w:val="Heading2"/>
+        <w:jc w:val="center"/>
       </w:pPr>
       <w:bookmarkStart w:id="1169" w:name="ex_ch2"/>
       <w:bookmarkEnd w:id="1169"/>
@@ -2509,7 +2605,12 @@
       </w:pPr>
       <w:r>
         <w:rPr>
+          <w:rFonts w:ascii="Amazon Ember" w:hAnsi="Amazon Ember" w:cs="Amazon Ember" w:eastAsia="Amazon Ember"/>
           <w:b/>
+          <w:bCs/>
+          <w:color w:val="0000FF"/>
+          <w:sz w:val="36"/>
+          <w:szCs w:val="36"/>
         </w:rPr>
         <w:t xml:space="preserve">Chapter 3</w:t>
       </w:r>
@@ -2517,6 +2618,7 @@
     <w:p>
       <w:pPr>
         <w:pStyle w:val="Heading1"/>
+        <w:jc w:val="center"/>
       </w:pPr>
       <w:bookmarkStart w:id="1150" w:name="ch03"/>
       <w:bookmarkEnd w:id="1150"/>
@@ -2600,6 +2702,7 @@
     <w:p>
       <w:pPr>
         <w:pStyle w:val="Heading2"/>
+        <w:jc w:val="center"/>
       </w:pPr>
       <w:r>
         <w:t>The problem with everyday experience</w:t>
@@ -2648,6 +2751,7 @@
     <w:p>
       <w:pPr>
         <w:pStyle w:val="Heading2"/>
+        <w:jc w:val="center"/>
       </w:pPr>
       <w:r>
         <w:lastRenderedPageBreak/>
@@ -2689,6 +2793,7 @@
     <w:p>
       <w:pPr>
         <w:pStyle w:val="Heading2"/>
+        <w:jc w:val="center"/>
       </w:pPr>
       <w:r>
         <w:t>The tug-of-war nobody can see</w:t>
@@ -2721,6 +2826,7 @@
     <w:p>
       <w:pPr>
         <w:pStyle w:val="Heading2"/>
+        <w:jc w:val="center"/>
       </w:pPr>
       <w:r>
         <w:t>Why you don’t fall through the floor</w:t>
@@ -2765,6 +2871,7 @@
     <w:p>
       <w:pPr>
         <w:pStyle w:val="Heading2"/>
+        <w:jc w:val="center"/>
       </w:pPr>
       <w:r>
         <w:t>Newton’s second law</w:t>
@@ -2823,6 +2930,7 @@
     <w:p>
       <w:pPr>
         <w:pStyle w:val="Heading2"/>
+        <w:jc w:val="center"/>
       </w:pPr>
       <w:r>
         <w:t>The shopping-cart experiment</w:t>
@@ -2863,6 +2971,7 @@
     <w:p>
       <w:pPr>
         <w:pStyle w:val="Heading2"/>
+        <w:jc w:val="center"/>
       </w:pPr>
       <w:r>
         <w:t>Mass and weight are not the same thing</w:t>
@@ -2903,6 +3012,7 @@
     <w:p>
       <w:pPr>
         <w:pStyle w:val="Heading2"/>
+        <w:jc w:val="center"/>
       </w:pPr>
       <w:r>
         <w:lastRenderedPageBreak/>
@@ -2936,6 +3046,7 @@
     <w:p>
       <w:pPr>
         <w:pStyle w:val="Heading2"/>
+        <w:jc w:val="center"/>
       </w:pPr>
       <w:r>
         <w:t>Newton’s third law: the universe pushes back</w:t>
@@ -2977,6 +3088,7 @@
     <w:p>
       <w:pPr>
         <w:pStyle w:val="Heading2"/>
+        <w:jc w:val="center"/>
       </w:pPr>
       <w:r>
         <w:t>The balloon that escapes</w:t>
@@ -3009,6 +3121,7 @@
     <w:p>
       <w:pPr>
         <w:pStyle w:val="Heading2"/>
+        <w:jc w:val="center"/>
       </w:pPr>
       <w:r>
         <w:t>Why pushing yourself away from something works</w:t>
@@ -3041,6 +3154,7 @@
     <w:p>
       <w:pPr>
         <w:pStyle w:val="Heading2"/>
+        <w:jc w:val="center"/>
       </w:pPr>
       <w:r>
         <w:lastRenderedPageBreak/>
@@ -3066,6 +3180,7 @@
     <w:p>
       <w:pPr>
         <w:pStyle w:val="Heading2"/>
+        <w:jc w:val="center"/>
       </w:pPr>
       <w:r>
         <w:t>What happens when forces balance?</w:t>
@@ -3106,6 +3221,7 @@
     <w:p>
       <w:pPr>
         <w:pStyle w:val="Heading2"/>
+        <w:jc w:val="center"/>
       </w:pPr>
       <w:r>
         <w:lastRenderedPageBreak/>
@@ -3155,6 +3271,7 @@
     <w:p>
       <w:pPr>
         <w:pStyle w:val="Heading2"/>
+        <w:jc w:val="center"/>
       </w:pPr>
       <w:r>
         <w:t>One last thought experiment</w:t>
@@ -3204,6 +3321,7 @@
     <w:p>
       <w:pPr>
         <w:pStyle w:val="Heading2"/>
+        <w:jc w:val="center"/>
       </w:pPr>
       <w:bookmarkStart w:id="1170" w:name="ex_ch3"/>
       <w:bookmarkEnd w:id="1170"/>
@@ -3301,7 +3419,12 @@
       </w:pPr>
       <w:r>
         <w:rPr>
+          <w:rFonts w:ascii="Amazon Ember" w:hAnsi="Amazon Ember" w:cs="Amazon Ember" w:eastAsia="Amazon Ember"/>
           <w:b/>
+          <w:bCs/>
+          <w:color w:val="0000FF"/>
+          <w:sz w:val="36"/>
+          <w:szCs w:val="36"/>
         </w:rPr>
         <w:t xml:space="preserve">Chapter 4</w:t>
       </w:r>
@@ -3309,6 +3432,7 @@
     <w:p>
       <w:pPr>
         <w:pStyle w:val="Heading1"/>
+        <w:jc w:val="center"/>
       </w:pPr>
       <w:bookmarkStart w:id="1151" w:name="ch04"/>
       <w:bookmarkEnd w:id="1151"/>
@@ -3364,6 +3488,7 @@
     </w:p>
     <w:p>
       <w:pPr>
+        <w:pageBreakBefore/>
         <w:jc w:val="both"/>
       </w:pPr>
       <w:r>
@@ -3390,6 +3515,7 @@
     <w:p>
       <w:pPr>
         <w:pStyle w:val="Heading2"/>
+        <w:jc w:val="center"/>
       </w:pPr>
       <w:r>
         <w:t>Energy is not a substance</w:t>
@@ -3426,6 +3552,7 @@
     <w:p>
       <w:pPr>
         <w:pStyle w:val="Heading2"/>
+        <w:jc w:val="center"/>
       </w:pPr>
       <w:r>
         <w:t>The roller coaster knows about energy</w:t>
@@ -3466,6 +3593,7 @@
     <w:p>
       <w:pPr>
         <w:pStyle w:val="Heading2"/>
+        <w:jc w:val="center"/>
       </w:pPr>
       <w:r>
         <w:t>Kinetic energy: the energy of motion</w:t>
@@ -3508,6 +3636,7 @@
     <w:p>
       <w:pPr>
         <w:pStyle w:val="Heading2"/>
+        <w:jc w:val="center"/>
       </w:pPr>
       <w:r>
         <w:t>The unfortunate shopping trolley</w:t>
@@ -3532,6 +3661,7 @@
     <w:p>
       <w:pPr>
         <w:pStyle w:val="Heading2"/>
+        <w:jc w:val="center"/>
       </w:pPr>
       <w:r>
         <w:t>Potential energy: the energy of possibility</w:t>
@@ -3565,6 +3695,7 @@
     <w:p>
       <w:pPr>
         <w:pStyle w:val="Heading2"/>
+        <w:jc w:val="center"/>
       </w:pPr>
       <w:r>
         <w:t>A battery is not a little box of electricity</w:t>
@@ -3597,6 +3728,7 @@
     <w:p>
       <w:pPr>
         <w:pStyle w:val="Heading2"/>
+        <w:jc w:val="center"/>
       </w:pPr>
       <w:r>
         <w:t>The phone in your pocket is an energy conversion machine</w:t>
@@ -3625,6 +3757,7 @@
     <w:p>
       <w:pPr>
         <w:pStyle w:val="Heading2"/>
+        <w:jc w:val="center"/>
       </w:pPr>
       <w:r>
         <w:t>Work: the bridge between force and energy</w:t>
@@ -3674,6 +3807,7 @@
     <w:p>
       <w:pPr>
         <w:pStyle w:val="Heading2"/>
+        <w:jc w:val="center"/>
       </w:pPr>
       <w:r>
         <w:lastRenderedPageBreak/>
@@ -3699,6 +3833,7 @@
     <w:p>
       <w:pPr>
         <w:pStyle w:val="Heading2"/>
+        <w:jc w:val="center"/>
       </w:pPr>
       <w:r>
         <w:t>Power: how quickly can you use energy?</w:t>
@@ -3748,6 +3883,7 @@
     <w:p>
       <w:pPr>
         <w:pStyle w:val="Heading2"/>
+        <w:jc w:val="center"/>
       </w:pPr>
       <w:r>
         <w:lastRenderedPageBreak/>
@@ -3773,6 +3909,7 @@
     <w:p>
       <w:pPr>
         <w:pStyle w:val="Heading2"/>
+        <w:jc w:val="center"/>
       </w:pPr>
       <w:r>
         <w:t>Energy from the Sun</w:t>
@@ -3842,6 +3979,7 @@
     <w:p>
       <w:pPr>
         <w:pStyle w:val="Heading2"/>
+        <w:jc w:val="center"/>
       </w:pPr>
       <w:r>
         <w:t>Energy is conserved — but the story gets stranger</w:t>
@@ -3878,6 +4016,7 @@
     <w:p>
       <w:pPr>
         <w:pStyle w:val="Heading2"/>
+        <w:jc w:val="center"/>
       </w:pPr>
       <w:r>
         <w:t>The universe is keeping score</w:t>
@@ -3910,6 +4049,7 @@
     <w:p>
       <w:pPr>
         <w:pStyle w:val="Heading2"/>
+        <w:jc w:val="center"/>
       </w:pPr>
       <w:r>
         <w:t xml:space="preserve">Summing Up</w:t>
@@ -3946,6 +4086,7 @@
     <w:p>
       <w:pPr>
         <w:pStyle w:val="Heading2"/>
+        <w:jc w:val="center"/>
       </w:pPr>
       <w:bookmarkStart w:id="1171" w:name="ex_ch4"/>
       <w:bookmarkEnd w:id="1171"/>
@@ -4042,7 +4183,12 @@
       </w:pPr>
       <w:r>
         <w:rPr>
+          <w:rFonts w:ascii="Amazon Ember" w:hAnsi="Amazon Ember" w:cs="Amazon Ember" w:eastAsia="Amazon Ember"/>
           <w:b/>
+          <w:bCs/>
+          <w:color w:val="0000FF"/>
+          <w:sz w:val="36"/>
+          <w:szCs w:val="36"/>
         </w:rPr>
         <w:t xml:space="preserve">Chapter 5</w:t>
       </w:r>
@@ -4050,6 +4196,7 @@
     <w:p>
       <w:pPr>
         <w:pStyle w:val="Heading1"/>
+        <w:jc w:val="center"/>
       </w:pPr>
       <w:bookmarkStart w:id="1152" w:name="ch04a"/>
       <w:bookmarkEnd w:id="1152"/>
@@ -4106,6 +4253,7 @@
     </w:p>
     <w:p>
       <w:pPr>
+        <w:pageBreakBefore/>
         <w:jc w:val="both"/>
       </w:pPr>
       <w:r>
@@ -4123,6 +4271,7 @@
     <w:p>
       <w:pPr>
         <w:pStyle w:val="Heading2"/>
+        <w:jc w:val="center"/>
       </w:pPr>
       <w:r>
         <w:lastRenderedPageBreak/>
@@ -4165,6 +4314,7 @@
     <w:p>
       <w:pPr>
         <w:pStyle w:val="Heading2"/>
+        <w:jc w:val="center"/>
       </w:pPr>
       <w:r>
         <w:t>Why the skaters fly apart at different speeds</w:t>
@@ -4207,6 +4357,7 @@
     <w:p>
       <w:pPr>
         <w:pStyle w:val="Heading2"/>
+        <w:jc w:val="center"/>
       </w:pPr>
       <w:r>
         <w:t>This is just Newton’s third law wearing a disguise</w:t>
@@ -4231,6 +4382,7 @@
     <w:p>
       <w:pPr>
         <w:pStyle w:val="Heading2"/>
+        <w:jc w:val="center"/>
       </w:pPr>
       <w:r>
         <w:t>Collisions: where momentum really earns its keep</w:t>
@@ -4259,6 +4411,7 @@
     <w:p>
       <w:pPr>
         <w:pStyle w:val="Heading2"/>
+        <w:jc w:val="center"/>
       </w:pPr>
       <w:r>
         <w:t>A worked example: the shopping cart collision nobody wants</w:t>
@@ -4317,6 +4470,7 @@
     <w:p>
       <w:pPr>
         <w:pStyle w:val="Heading2"/>
+        <w:jc w:val="center"/>
       </w:pPr>
       <w:r>
         <w:t>Why heavier vehicles are more dangerous in crashes</w:t>
@@ -4342,6 +4496,7 @@
     <w:p>
       <w:pPr>
         <w:pStyle w:val="Heading2"/>
+        <w:jc w:val="center"/>
       </w:pPr>
       <w:r>
         <w:t>Rockets: the ultimate momentum trick</w:t>
@@ -4374,6 +4529,7 @@
     <w:p>
       <w:pPr>
         <w:pStyle w:val="Heading2"/>
+        <w:jc w:val="center"/>
       </w:pPr>
       <w:r>
         <w:t>Momentum in more than one direction</w:t>
@@ -4394,6 +4550,7 @@
     <w:p>
       <w:pPr>
         <w:pStyle w:val="Heading2"/>
+        <w:jc w:val="center"/>
       </w:pPr>
       <w:r>
         <w:t>Why the universe bothers keeping this particular set of books</w:t>
@@ -4422,6 +4579,7 @@
     <w:p>
       <w:pPr>
         <w:pStyle w:val="Heading2"/>
+        <w:jc w:val="center"/>
       </w:pPr>
       <w:r>
         <w:t xml:space="preserve">Summing Up</w:t>
@@ -4446,6 +4604,7 @@
     <w:p>
       <w:pPr>
         <w:pStyle w:val="Heading2"/>
+        <w:jc w:val="center"/>
       </w:pPr>
       <w:bookmarkStart w:id="1172" w:name="ex_ch5"/>
       <w:bookmarkEnd w:id="1172"/>
@@ -4542,7 +4701,12 @@
       </w:pPr>
       <w:r>
         <w:rPr>
+          <w:rFonts w:ascii="Amazon Ember" w:hAnsi="Amazon Ember" w:cs="Amazon Ember" w:eastAsia="Amazon Ember"/>
           <w:b/>
+          <w:bCs/>
+          <w:color w:val="0000FF"/>
+          <w:sz w:val="36"/>
+          <w:szCs w:val="36"/>
         </w:rPr>
         <w:t xml:space="preserve">Chapter 6</w:t>
       </w:r>
@@ -4550,6 +4714,7 @@
     <w:p>
       <w:pPr>
         <w:pStyle w:val="Heading1"/>
+        <w:jc w:val="center"/>
       </w:pPr>
       <w:bookmarkStart w:id="1153" w:name="ch04b"/>
       <w:bookmarkEnd w:id="1153"/>
@@ -4605,6 +4770,7 @@
     </w:p>
     <w:p>
       <w:pPr>
+        <w:pageBreakBefore/>
         <w:spacing w:after="200" w:line="276" w:lineRule="auto"/>
         <w:jc w:val="left"/>
       </w:pPr>
@@ -4627,6 +4793,7 @@
     <w:p>
       <w:pPr>
         <w:pStyle w:val="Heading2"/>
+        <w:jc w:val="center"/>
       </w:pPr>
       <w:r>
         <w:t>Momentum, but for spinning things</w:t>
@@ -4668,6 +4835,7 @@
     <w:p>
       <w:pPr>
         <w:pStyle w:val="Heading2"/>
+        <w:jc w:val="center"/>
       </w:pPr>
       <w:r>
         <w:t>Why pulling your arms in makes you spin faster</w:t>
@@ -4704,6 +4872,7 @@
     <w:p>
       <w:pPr>
         <w:pStyle w:val="Heading2"/>
+        <w:jc w:val="center"/>
       </w:pPr>
       <w:r>
         <w:t>The same trick, everywhere you look</w:t>
@@ -4728,6 +4897,7 @@
     <w:p>
       <w:pPr>
         <w:pStyle w:val="Heading2"/>
+        <w:jc w:val="center"/>
       </w:pPr>
       <w:r>
         <w:t>Why spinning tops refuse to fall over</w:t>
@@ -4764,6 +4934,7 @@
     <w:p>
       <w:pPr>
         <w:pStyle w:val="Heading2"/>
+        <w:jc w:val="center"/>
       </w:pPr>
       <w:r>
         <w:t>The Earth is a giant, slowly wobbling top</w:t>
@@ -4780,6 +4951,7 @@
     <w:p>
       <w:pPr>
         <w:pStyle w:val="Heading2"/>
+        <w:jc w:val="center"/>
       </w:pPr>
       <w:r>
         <w:lastRenderedPageBreak/>
@@ -4805,6 +4977,7 @@
     <w:p>
       <w:pPr>
         <w:pStyle w:val="Heading2"/>
+        <w:jc w:val="center"/>
       </w:pPr>
       <w:r>
         <w:t>Angular momentum and the shape of orbits</w:t>
@@ -4821,6 +4994,7 @@
     <w:p>
       <w:pPr>
         <w:pStyle w:val="Heading2"/>
+        <w:jc w:val="center"/>
       </w:pPr>
       <w:r>
         <w:t xml:space="preserve">Why this matters beyond the classroom</w:t>
@@ -4837,6 +5011,7 @@
     <w:p>
       <w:pPr>
         <w:pStyle w:val="Heading2"/>
+        <w:jc w:val="center"/>
       </w:pPr>
       <w:r>
         <w:t xml:space="preserve">Summing Up</w:t>
@@ -4861,6 +5036,7 @@
     <w:p>
       <w:pPr>
         <w:pStyle w:val="Heading2"/>
+        <w:jc w:val="center"/>
       </w:pPr>
       <w:bookmarkStart w:id="1173" w:name="ex_ch6"/>
       <w:bookmarkEnd w:id="1173"/>
@@ -4957,7 +5133,12 @@
       </w:pPr>
       <w:r>
         <w:rPr>
+          <w:rFonts w:ascii="Amazon Ember" w:hAnsi="Amazon Ember" w:cs="Amazon Ember" w:eastAsia="Amazon Ember"/>
           <w:b/>
+          <w:bCs/>
+          <w:color w:val="0000FF"/>
+          <w:sz w:val="36"/>
+          <w:szCs w:val="36"/>
         </w:rPr>
         <w:t xml:space="preserve">Chapter 7</w:t>
       </w:r>
@@ -4965,6 +5146,7 @@
     <w:p>
       <w:pPr>
         <w:pStyle w:val="Heading1"/>
+        <w:jc w:val="center"/>
       </w:pPr>
       <w:bookmarkStart w:id="1154" w:name="ch04c"/>
       <w:bookmarkEnd w:id="1154"/>
@@ -5021,6 +5203,8 @@
     <w:p>
       <w:pPr>
         <w:pStyle w:val="Heading2"/>
+        <w:pageBreakBefore/>
+        <w:jc w:val="center"/>
       </w:pPr>
       <w:bookmarkStart w:id="1174" w:name="ex_ch7"/>
       <w:bookmarkEnd w:id="1174"/>
@@ -5141,6 +5325,7 @@
     <w:p>
       <w:pPr>
         <w:pStyle w:val="Heading2"/>
+        <w:jc w:val="center"/>
       </w:pPr>
       <w:r>
         <w:t>The defining feature: a restoring force</w:t>
@@ -5182,6 +5367,7 @@
     <w:p>
       <w:pPr>
         <w:pStyle w:val="Heading2"/>
+        <w:jc w:val="center"/>
       </w:pPr>
       <w:r>
         <w:lastRenderedPageBreak/>
@@ -5207,6 +5393,7 @@
     <w:p>
       <w:pPr>
         <w:pStyle w:val="Heading2"/>
+        <w:jc w:val="center"/>
       </w:pPr>
       <w:r>
         <w:t>The remarkable independence from amplitude</w:t>
@@ -5252,6 +5439,7 @@
     <w:p>
       <w:pPr>
         <w:pStyle w:val="Heading2"/>
+        <w:jc w:val="center"/>
       </w:pPr>
       <w:r>
         <w:t>The pendulum: gravity’s own metronome</w:t>
@@ -5301,6 +5489,7 @@
     <w:p>
       <w:pPr>
         <w:pStyle w:val="Heading2"/>
+        <w:jc w:val="center"/>
       </w:pPr>
       <w:r>
         <w:lastRenderedPageBreak/>
@@ -5335,6 +5524,7 @@
     <w:p>
       <w:pPr>
         <w:pStyle w:val="Heading2"/>
+        <w:jc w:val="center"/>
       </w:pPr>
       <w:r>
         <w:t>Beyond springs and pendulums</w:t>
@@ -5363,6 +5553,7 @@
     <w:p>
       <w:pPr>
         <w:pStyle w:val="Heading2"/>
+        <w:jc w:val="center"/>
       </w:pPr>
       <w:r>
         <w:t>When the rhythm fades: damping and driving</w:t>
@@ -5387,6 +5578,7 @@
     <w:p>
       <w:pPr>
         <w:pStyle w:val="Heading2"/>
+        <w:jc w:val="center"/>
       </w:pPr>
       <w:r>
         <w:t xml:space="preserve">Summing Up</w:t>
@@ -5425,7 +5617,12 @@
       </w:pPr>
       <w:r>
         <w:rPr>
+          <w:rFonts w:ascii="Amazon Ember" w:hAnsi="Amazon Ember" w:cs="Amazon Ember" w:eastAsia="Amazon Ember"/>
           <w:b/>
+          <w:bCs/>
+          <w:color w:val="0000FF"/>
+          <w:sz w:val="36"/>
+          <w:szCs w:val="36"/>
         </w:rPr>
         <w:t xml:space="preserve">Chapter 8</w:t>
       </w:r>
@@ -5433,6 +5630,7 @@
     <w:p>
       <w:pPr>
         <w:pStyle w:val="Heading1"/>
+        <w:jc w:val="center"/>
       </w:pPr>
       <w:bookmarkStart w:id="1155" w:name="ch04d"/>
       <w:bookmarkEnd w:id="1155"/>
@@ -5489,6 +5687,7 @@
     </w:p>
     <w:p>
       <w:pPr>
+        <w:pageBreakBefore/>
         <w:jc w:val="both"/>
       </w:pPr>
       <w:r>
@@ -5510,6 +5709,7 @@
     <w:p>
       <w:pPr>
         <w:pStyle w:val="Heading2"/>
+        <w:jc w:val="center"/>
       </w:pPr>
       <w:r>
         <w:t>A wave is a traveling pattern, not a traveling substance</w:t>
@@ -5534,6 +5734,7 @@
     <w:p>
       <w:pPr>
         <w:pStyle w:val="Heading2"/>
+        <w:jc w:val="center"/>
       </w:pPr>
       <w:r>
         <w:t>The vocabulary of waves</w:t>
@@ -5579,6 +5780,7 @@
     <w:p>
       <w:pPr>
         <w:pStyle w:val="Heading2"/>
+        <w:jc w:val="center"/>
       </w:pPr>
       <w:r>
         <w:t>A worked example: the speed of sound</w:t>
@@ -5612,6 +5814,7 @@
     <w:p>
       <w:pPr>
         <w:pStyle w:val="Heading2"/>
+        <w:jc w:val="center"/>
       </w:pPr>
       <w:r>
         <w:t>Waves that need a medium, and waves that do not</w:t>
@@ -5640,6 +5843,7 @@
     <w:p>
       <w:pPr>
         <w:pStyle w:val="Heading2"/>
+        <w:jc w:val="center"/>
       </w:pPr>
       <w:r>
         <w:t>Transverse and longitudinal: two ways to wiggle</w:t>
@@ -5664,6 +5868,7 @@
     <w:p>
       <w:pPr>
         <w:pStyle w:val="Heading2"/>
+        <w:jc w:val="center"/>
       </w:pPr>
       <w:r>
         <w:t>When waves meet: interference</w:t>
@@ -5692,6 +5897,7 @@
     <w:p>
       <w:pPr>
         <w:pStyle w:val="Heading2"/>
+        <w:jc w:val="center"/>
       </w:pPr>
       <w:r>
         <w:t>Standing waves and the physics of music</w:t>
@@ -5716,6 +5922,7 @@
     <w:p>
       <w:pPr>
         <w:pStyle w:val="Heading2"/>
+        <w:jc w:val="center"/>
       </w:pPr>
       <w:r>
         <w:lastRenderedPageBreak/>
@@ -5741,6 +5948,7 @@
     <w:p>
       <w:pPr>
         <w:pStyle w:val="Heading2"/>
+        <w:jc w:val="center"/>
       </w:pPr>
       <w:r>
         <w:t>Why this chapter matters for everything that follows</w:t>
@@ -5757,6 +5965,7 @@
     <w:p>
       <w:pPr>
         <w:pStyle w:val="Heading2"/>
+        <w:jc w:val="center"/>
       </w:pPr>
       <w:r>
         <w:t xml:space="preserve">Summing Up</w:t>
@@ -5785,6 +5994,7 @@
     <w:p>
       <w:pPr>
         <w:pStyle w:val="Heading2"/>
+        <w:jc w:val="center"/>
       </w:pPr>
       <w:bookmarkStart w:id="1175" w:name="ex_ch8"/>
       <w:bookmarkEnd w:id="1175"/>
@@ -5881,7 +6091,12 @@
       </w:pPr>
       <w:r>
         <w:rPr>
+          <w:rFonts w:ascii="Amazon Ember" w:hAnsi="Amazon Ember" w:cs="Amazon Ember" w:eastAsia="Amazon Ember"/>
           <w:b/>
+          <w:bCs/>
+          <w:color w:val="0000FF"/>
+          <w:sz w:val="36"/>
+          <w:szCs w:val="36"/>
         </w:rPr>
         <w:t xml:space="preserve">Chapter 9</w:t>
       </w:r>
@@ -5889,6 +6104,7 @@
     <w:p>
       <w:pPr>
         <w:pStyle w:val="Heading1"/>
+        <w:jc w:val="center"/>
       </w:pPr>
       <w:bookmarkStart w:id="1156" w:name="ch33"/>
       <w:bookmarkEnd w:id="1156"/>
@@ -5942,6 +6158,9 @@
       </w:r>
     </w:p>
     <w:p>
+      <w:pPr>
+        <w:pageBreakBefore/>
+      </w:pPr>
       <w:r>
         <w:lastRenderedPageBreak/>
         <w:t>A ball rolls from the top of a hill to the bottom. You could, in principle, describe every single instant of that journey: its position, its speed, the forces acting on it moment by moment. Newton would be entirely satisfied with that description, and for nearly two centuries, so was everyone else.</w:t>
@@ -5966,6 +6185,7 @@
     <w:p>
       <w:pPr>
         <w:pStyle w:val="Heading2"/>
+        <w:jc w:val="center"/>
       </w:pPr>
       <w:r>
         <w:t>The Universe Is Late for Everything</w:t>
@@ -5998,6 +6218,7 @@
     <w:p>
       <w:pPr>
         <w:pStyle w:val="Heading2"/>
+        <w:jc w:val="center"/>
       </w:pPr>
       <w:r>
         <w:lastRenderedPageBreak/>
@@ -6031,6 +6252,7 @@
     <w:p>
       <w:pPr>
         <w:pStyle w:val="Heading2"/>
+        <w:jc w:val="center"/>
       </w:pPr>
       <w:r>
         <w:t>What “Action” Actually Means</w:t>
@@ -6067,6 +6289,7 @@
     <w:p>
       <w:pPr>
         <w:pStyle w:val="Heading2"/>
+        <w:jc w:val="center"/>
       </w:pPr>
       <w:r>
         <w:t>Light Gives Away the Secret</w:t>
@@ -6091,6 +6314,7 @@
     <w:p>
       <w:pPr>
         <w:pStyle w:val="Heading2"/>
+        <w:jc w:val="center"/>
       </w:pPr>
       <w:r>
         <w:t>A Worked Example: The Lifeguard’s Dilemma</w:t>
@@ -6135,6 +6359,7 @@
     <w:p>
       <w:pPr>
         <w:pStyle w:val="Heading2"/>
+        <w:jc w:val="center"/>
       </w:pPr>
       <w:r>
         <w:t>Newton, Lagrange, and Feynman</w:t>
@@ -6179,6 +6404,7 @@
     <w:p>
       <w:pPr>
         <w:pStyle w:val="Heading2"/>
+        <w:jc w:val="center"/>
       </w:pPr>
       <w:r>
         <w:t>Why Does Nature “Choose” Anything?</w:t>
@@ -6211,6 +6437,7 @@
     <w:p>
       <w:pPr>
         <w:pStyle w:val="Heading2"/>
+        <w:jc w:val="center"/>
       </w:pPr>
       <w:r>
         <w:t xml:space="preserve">Summing Up</w:t>
@@ -6239,6 +6466,7 @@
     <w:p>
       <w:pPr>
         <w:pStyle w:val="Heading2"/>
+        <w:jc w:val="center"/>
       </w:pPr>
       <w:bookmarkStart w:id="1176" w:name="ex_ch9"/>
       <w:bookmarkEnd w:id="1176"/>
@@ -6343,6 +6571,7 @@
     <w:p>
       <w:pPr>
         <w:pStyle w:val="Heading1"/>
+        <w:jc w:val="center"/>
       </w:pPr>
       <w:bookmarkStart w:id="1157" w:name="part10"/>
       <w:bookmarkEnd w:id="1157"/>
@@ -6374,7 +6603,12 @@
       </w:pPr>
       <w:r>
         <w:rPr>
+          <w:rFonts w:ascii="Amazon Ember" w:hAnsi="Amazon Ember" w:cs="Amazon Ember" w:eastAsia="Amazon Ember"/>
           <w:b/>
+          <w:bCs/>
+          <w:color w:val="0000FF"/>
+          <w:sz w:val="36"/>
+          <w:szCs w:val="36"/>
         </w:rPr>
         <w:t xml:space="preserve">Chapter 10</w:t>
       </w:r>
@@ -6382,6 +6616,7 @@
     <w:p>
       <w:pPr>
         <w:pStyle w:val="Heading1"/>
+        <w:jc w:val="center"/>
       </w:pPr>
       <w:bookmarkStart w:id="1158" w:name="ch00"/>
       <w:bookmarkEnd w:id="1158"/>
@@ -6439,6 +6674,8 @@
     <w:p>
       <w:pPr>
         <w:pStyle w:val="Heading2"/>
+        <w:pageBreakBefore/>
+        <w:jc w:val="center"/>
       </w:pPr>
       <w:r>
         <w:t>You Are Already Living in an Electromagnetic Universe</w:t>
@@ -6464,6 +6701,7 @@
     <w:p>
       <w:pPr>
         <w:pStyle w:val="Heading2"/>
+        <w:jc w:val="center"/>
       </w:pPr>
       <w:r>
         <w:t>Electric charge: the first oddity</w:t>
@@ -6496,6 +6734,7 @@
     <w:p>
       <w:pPr>
         <w:pStyle w:val="Heading2"/>
+        <w:jc w:val="center"/>
       </w:pPr>
       <w:r>
         <w:t>An electric field is not an invisible wind</w:t>
@@ -6520,6 +6759,7 @@
     <w:p>
       <w:pPr>
         <w:pStyle w:val="Heading2"/>
+        <w:jc w:val="center"/>
       </w:pPr>
       <w:r>
         <w:t>Magnets are not magic either</w:t>
@@ -6545,6 +6785,7 @@
     <w:p>
       <w:pPr>
         <w:pStyle w:val="Heading2"/>
+        <w:jc w:val="center"/>
       </w:pPr>
       <w:r>
         <w:t>Moving charges make magnetism</w:t>
@@ -6569,6 +6810,7 @@
     <w:p>
       <w:pPr>
         <w:pStyle w:val="Heading2"/>
+        <w:jc w:val="center"/>
       </w:pPr>
       <w:r>
         <w:t>Faraday’s great discovery</w:t>
@@ -6602,6 +6844,7 @@
     <w:p>
       <w:pPr>
         <w:pStyle w:val="Heading2"/>
+        <w:jc w:val="center"/>
       </w:pPr>
       <w:r>
         <w:t>Maxwell puts the pieces together</w:t>
@@ -6626,6 +6869,7 @@
     <w:p>
       <w:pPr>
         <w:pStyle w:val="Heading2"/>
+        <w:jc w:val="center"/>
       </w:pPr>
       <w:r>
         <w:lastRenderedPageBreak/>
@@ -6736,6 +6980,7 @@
     <w:p>
       <w:pPr>
         <w:pStyle w:val="Heading2"/>
+        <w:jc w:val="center"/>
       </w:pPr>
       <w:r>
         <w:t>Light is an electromagnetic wave</w:t>
@@ -6764,6 +7009,7 @@
     <w:p>
       <w:pPr>
         <w:pStyle w:val="Heading2"/>
+        <w:jc w:val="center"/>
       </w:pPr>
       <w:r>
         <w:t>The electromagnetic spectrum</w:t>
@@ -6796,6 +7042,7 @@
     <w:p>
       <w:pPr>
         <w:pStyle w:val="Heading2"/>
+        <w:jc w:val="center"/>
       </w:pPr>
       <w:r>
         <w:t>Radio waves: invisible light</w:t>
@@ -6828,6 +7075,7 @@
     <w:p>
       <w:pPr>
         <w:pStyle w:val="Heading2"/>
+        <w:jc w:val="center"/>
       </w:pPr>
       <w:r>
         <w:t>How an antenna talks to space</w:t>
@@ -6856,6 +7104,7 @@
     <w:p>
       <w:pPr>
         <w:pStyle w:val="Heading2"/>
+        <w:jc w:val="center"/>
       </w:pPr>
       <w:r>
         <w:t>Why radio waves can carry information</w:t>
@@ -6880,6 +7129,7 @@
     <w:p>
       <w:pPr>
         <w:pStyle w:val="Heading2"/>
+        <w:jc w:val="center"/>
       </w:pPr>
       <w:r>
         <w:t>Radio, television, Wi-Fi, and your phone</w:t>
@@ -6912,6 +7162,7 @@
     <w:p>
       <w:pPr>
         <w:pStyle w:val="Heading2"/>
+        <w:jc w:val="center"/>
       </w:pPr>
       <w:r>
         <w:lastRenderedPageBreak/>
@@ -6937,6 +7188,7 @@
     <w:p>
       <w:pPr>
         <w:pStyle w:val="Heading2"/>
+        <w:jc w:val="center"/>
       </w:pPr>
       <w:r>
         <w:t xml:space="preserve">The ether, and why it went away</w:t>
@@ -6961,6 +7213,7 @@
     <w:p>
       <w:pPr>
         <w:pStyle w:val="Heading2"/>
+        <w:jc w:val="center"/>
       </w:pPr>
       <w:r>
         <w:lastRenderedPageBreak/>
@@ -6986,6 +7239,7 @@
     <w:p>
       <w:pPr>
         <w:pStyle w:val="Heading2"/>
+        <w:jc w:val="center"/>
       </w:pPr>
       <w:r>
         <w:t>Energy travels in the field</w:t>
@@ -7010,6 +7264,7 @@
     <w:p>
       <w:pPr>
         <w:pStyle w:val="Heading2"/>
+        <w:jc w:val="center"/>
       </w:pPr>
       <w:r>
         <w:t>The bridge to quantum physics</w:t>
@@ -7034,6 +7289,7 @@
     <w:p>
       <w:pPr>
         <w:pStyle w:val="Heading2"/>
+        <w:jc w:val="center"/>
       </w:pPr>
       <w:r>
         <w:lastRenderedPageBreak/>
@@ -7067,6 +7323,7 @@
     <w:p>
       <w:pPr>
         <w:pStyle w:val="Heading2"/>
+        <w:jc w:val="center"/>
       </w:pPr>
       <w:r>
         <w:t xml:space="preserve">Why electromagnetism leads to relativity</w:t>
@@ -7091,6 +7348,7 @@
     <w:p>
       <w:pPr>
         <w:pStyle w:val="Heading2"/>
+        <w:jc w:val="center"/>
       </w:pPr>
       <w:r>
         <w:t>The electromagnetic picture to remember</w:t>
@@ -7123,6 +7381,7 @@
     <w:p>
       <w:pPr>
         <w:pStyle w:val="Heading2"/>
+        <w:jc w:val="center"/>
       </w:pPr>
       <w:r>
         <w:lastRenderedPageBreak/>
@@ -7164,6 +7423,7 @@
     <w:p>
       <w:pPr>
         <w:pStyle w:val="Heading2"/>
+        <w:jc w:val="center"/>
       </w:pPr>
       <w:bookmarkStart w:id="1177" w:name="ex_ch10"/>
       <w:bookmarkEnd w:id="1177"/>
@@ -7260,7 +7520,12 @@
       </w:pPr>
       <w:r>
         <w:rPr>
+          <w:rFonts w:ascii="Amazon Ember" w:hAnsi="Amazon Ember" w:cs="Amazon Ember" w:eastAsia="Amazon Ember"/>
           <w:b/>
+          <w:bCs/>
+          <w:color w:val="0000FF"/>
+          <w:sz w:val="36"/>
+          <w:szCs w:val="36"/>
         </w:rPr>
         <w:t xml:space="preserve">Chapter 11</w:t>
       </w:r>
@@ -7268,6 +7533,7 @@
     <w:p>
       <w:pPr>
         <w:pStyle w:val="Heading1"/>
+        <w:jc w:val="center"/>
       </w:pPr>
       <w:bookmarkStart w:id="1159" w:name="ch34"/>
       <w:bookmarkEnd w:id="1159"/>
@@ -7321,6 +7587,9 @@
       </w:r>
     </w:p>
     <w:p>
+      <w:pPr>
+        <w:pageBreakBefore/>
+      </w:pPr>
       <w:r>
         <w:lastRenderedPageBreak/>
         <w:t>Turn on a lamp. The room changes almost instantly, and it is tempting to think light simply appears everywhere at once. It does not. Light travels at a finite, if enormous, speed: about 300,000 kilometers, or 186,000 miles, per second.</w:t>
@@ -7337,6 +7606,7 @@
     <w:p>
       <w:pPr>
         <w:pStyle w:val="Heading2"/>
+        <w:jc w:val="center"/>
       </w:pPr>
       <w:r>
         <w:t>The Speed Limit Is Weird</w:t>
@@ -7369,6 +7639,7 @@
     <w:p>
       <w:pPr>
         <w:pStyle w:val="Heading2"/>
+        <w:jc w:val="center"/>
       </w:pPr>
       <w:r>
         <w:t>A Worked Example: How Big Is a Light-Year, Really?</w:t>
@@ -7405,6 +7676,7 @@
     <w:p>
       <w:pPr>
         <w:pStyle w:val="Heading2"/>
+        <w:jc w:val="center"/>
       </w:pPr>
       <w:r>
         <w:t>Light Needs No Ether</w:t>
@@ -7461,6 +7733,7 @@
     <w:p>
       <w:pPr>
         <w:pStyle w:val="Heading2"/>
+        <w:jc w:val="center"/>
       </w:pPr>
       <w:r>
         <w:t>Wave or Particle? Yes.</w:t>
@@ -7505,6 +7778,7 @@
     <w:p>
       <w:pPr>
         <w:pStyle w:val="Heading2"/>
+        <w:jc w:val="center"/>
       </w:pPr>
       <w:r>
         <w:t>Then Came the Photon</w:t>
@@ -7565,6 +7839,7 @@
     <w:p>
       <w:pPr>
         <w:pStyle w:val="Heading2"/>
+        <w:jc w:val="center"/>
       </w:pPr>
       <w:r>
         <w:t>Colors Are Quantum Physics</w:t>
@@ -7613,6 +7888,7 @@
     <w:p>
       <w:pPr>
         <w:pStyle w:val="Heading2"/>
+        <w:jc w:val="center"/>
       </w:pPr>
       <w:r>
         <w:t xml:space="preserve">Summing Up</w:t>
@@ -7637,6 +7913,7 @@
     <w:p>
       <w:pPr>
         <w:pStyle w:val="Heading2"/>
+        <w:jc w:val="center"/>
       </w:pPr>
       <w:bookmarkStart w:id="1178" w:name="ex_ch11"/>
       <w:bookmarkEnd w:id="1178"/>
@@ -7733,7 +8010,12 @@
       </w:pPr>
       <w:r>
         <w:rPr>
+          <w:rFonts w:ascii="Amazon Ember" w:hAnsi="Amazon Ember" w:cs="Amazon Ember" w:eastAsia="Amazon Ember"/>
           <w:b/>
+          <w:bCs/>
+          <w:color w:val="0000FF"/>
+          <w:sz w:val="36"/>
+          <w:szCs w:val="36"/>
         </w:rPr>
         <w:t xml:space="preserve">Chapter 12</w:t>
       </w:r>
@@ -7741,6 +8023,7 @@
     <w:p>
       <w:pPr>
         <w:pStyle w:val="Heading1"/>
+        <w:jc w:val="center"/>
       </w:pPr>
       <w:bookmarkStart w:id="1160" w:name="ch39"/>
       <w:bookmarkEnd w:id="1160"/>
@@ -7750,6 +8033,48 @@
     </w:p>
     <w:p>
       <w:pPr>
+        <w:keepLines/>
+        <w:spacing w:before="0" w:after="0"/>
+        <w:jc w:val="center"/>
+      </w:pPr>
+      <w:r>
+        <w:drawing>
+          <wp:inline xmlns:a="http://schemas.openxmlformats.org/drawingml/2006/main" xmlns:pic="http://schemas.openxmlformats.org/drawingml/2006/picture">
+            <wp:extent cx="3145536" cy="4718304"/>
+            <wp:docPr id="507175842" name="Chapter12OpticsOpeningCard" descr="Chapter 12 opener: atmospheric refraction, a bent straw, and light guided inside a glass fiber."/>
+            <wp:cNvGraphicFramePr>
+              <a:graphicFrameLocks noChangeAspect="1"/>
+            </wp:cNvGraphicFramePr>
+            <a:graphic>
+              <a:graphicData uri="http://schemas.openxmlformats.org/drawingml/2006/picture">
+                <pic:pic>
+                  <pic:nvPicPr>
+                    <pic:cNvPr id="0" name="Chapter-12-Optics-opening-card.jpg"/>
+                    <pic:cNvPicPr/>
+                  </pic:nvPicPr>
+                  <pic:blipFill>
+                    <a:blip r:embed="rId28"/>
+                    <a:stretch>
+                      <a:fillRect/>
+                    </a:stretch>
+                  </pic:blipFill>
+                  <pic:spPr>
+                    <a:xfrm>
+                      <a:off x="0" y="0"/>
+                      <a:ext cx="3145536" cy="4718304"/>
+                    </a:xfrm>
+                    <a:prstGeom prst="rect"/>
+                  </pic:spPr>
+                </pic:pic>
+              </a:graphicData>
+            </a:graphic>
+          </wp:inline>
+        </w:drawing>
+      </w:r>
+    </w:p>
+    <w:p>
+      <w:pPr>
+        <w:pageBreakBefore/>
         <w:jc w:val="both"/>
       </w:pPr>
       <w:r>
@@ -7767,6 +8092,7 @@
     <w:p>
       <w:pPr>
         <w:pStyle w:val="Heading2"/>
+        <w:jc w:val="center"/>
       </w:pPr>
       <w:r>
         <w:t xml:space="preserve">Light Slows Down</w:t>
@@ -7791,6 +8117,7 @@
     <w:p>
       <w:pPr>
         <w:pStyle w:val="Heading2"/>
+        <w:jc w:val="center"/>
       </w:pPr>
       <w:r>
         <w:t xml:space="preserve">A Worked Example: Why a Straw Looks Broken</w:t>
@@ -7835,6 +8162,7 @@
     <w:p>
       <w:pPr>
         <w:pStyle w:val="Heading2"/>
+        <w:jc w:val="center"/>
       </w:pPr>
       <w:r>
         <w:t xml:space="preserve">Trapped Light</w:t>
@@ -7879,6 +8207,7 @@
     <w:p>
       <w:pPr>
         <w:pStyle w:val="Heading2"/>
+        <w:jc w:val="center"/>
       </w:pPr>
       <w:r>
         <w:t xml:space="preserve">Mirages</w:t>
@@ -7903,6 +8232,7 @@
     <w:p>
       <w:pPr>
         <w:pStyle w:val="Heading2"/>
+        <w:jc w:val="center"/>
       </w:pPr>
       <w:r>
         <w:t xml:space="preserve">The Rainbow Is a Cone With You at the Tip</w:t>
@@ -7943,6 +8273,7 @@
     <w:p>
       <w:pPr>
         <w:pStyle w:val="Heading2"/>
+        <w:jc w:val="center"/>
       </w:pPr>
       <w:r>
         <w:t xml:space="preserve">Why the Sky Is Blue, and Not Violet</w:t>
@@ -7967,6 +8298,7 @@
     <w:p>
       <w:pPr>
         <w:pStyle w:val="Heading2"/>
+        <w:jc w:val="center"/>
       </w:pPr>
       <w:r>
         <w:t xml:space="preserve">When Light Plus Light Makes Darkness</w:t>
@@ -8007,6 +8339,7 @@
     <w:p>
       <w:pPr>
         <w:pStyle w:val="Heading2"/>
+        <w:jc w:val="center"/>
       </w:pPr>
       <w:r>
         <w:t xml:space="preserve">The Limit Every Lens Obeys</w:t>
@@ -8051,6 +8384,7 @@
     <w:p>
       <w:pPr>
         <w:pStyle w:val="Heading2"/>
+        <w:jc w:val="center"/>
       </w:pPr>
       <w:r>
         <w:t xml:space="preserve">Your Eye Is a Camera That Lies Politely</w:t>
@@ -8075,6 +8409,7 @@
     <w:p>
       <w:pPr>
         <w:pStyle w:val="Heading2"/>
+        <w:jc w:val="center"/>
       </w:pPr>
       <w:r>
         <w:t xml:space="preserve">The Hidden Direction of Light</w:t>
@@ -8099,6 +8434,7 @@
     <w:p>
       <w:pPr>
         <w:pStyle w:val="Heading2"/>
+        <w:jc w:val="center"/>
       </w:pPr>
       <w:r>
         <w:t xml:space="preserve">Light in Lockstep</w:t>
@@ -8140,6 +8476,7 @@
     <w:p>
       <w:pPr>
         <w:pStyle w:val="Heading2"/>
+        <w:jc w:val="center"/>
       </w:pPr>
       <w:r>
         <w:t xml:space="preserve">Summing Up</w:t>
@@ -8172,6 +8509,7 @@
     <w:p>
       <w:pPr>
         <w:pStyle w:val="Heading2"/>
+        <w:jc w:val="center"/>
       </w:pPr>
       <w:bookmarkStart w:id="1179" w:name="ex_ch12"/>
       <w:bookmarkEnd w:id="1179"/>
@@ -8276,6 +8614,7 @@
     <w:p>
       <w:pPr>
         <w:pStyle w:val="Heading1"/>
+        <w:jc w:val="center"/>
       </w:pPr>
       <w:bookmarkStart w:id="1161" w:name="part13"/>
       <w:bookmarkEnd w:id="1161"/>
@@ -8307,7 +8646,12 @@
       </w:pPr>
       <w:r>
         <w:rPr>
+          <w:rFonts w:ascii="Amazon Ember" w:hAnsi="Amazon Ember" w:cs="Amazon Ember" w:eastAsia="Amazon Ember"/>
           <w:b/>
+          <w:bCs/>
+          <w:color w:val="0000FF"/>
+          <w:sz w:val="36"/>
+          <w:szCs w:val="36"/>
         </w:rPr>
         <w:t xml:space="preserve">Chapter 13</w:t>
       </w:r>
@@ -8315,6 +8659,7 @@
     <w:p>
       <w:pPr>
         <w:pStyle w:val="Heading1"/>
+        <w:jc w:val="center"/>
       </w:pPr>
       <w:bookmarkStart w:id="1162" w:name="ch05"/>
       <w:bookmarkEnd w:id="1162"/>
@@ -8370,6 +8715,7 @@
     </w:p>
     <w:p>
       <w:pPr>
+        <w:pageBreakBefore/>
         <w:jc w:val="both"/>
       </w:pPr>
       <w:r>
@@ -8396,6 +8742,7 @@
     <w:p>
       <w:pPr>
         <w:pStyle w:val="Heading2"/>
+        <w:jc w:val="center"/>
       </w:pPr>
       <w:r>
         <w:t>The strange one-way street</w:t>
@@ -8444,6 +8791,7 @@
     <w:p>
       <w:pPr>
         <w:pStyle w:val="Heading2"/>
+        <w:jc w:val="center"/>
       </w:pPr>
       <w:r>
         <w:t>The coffee knows something you don’t</w:t>
@@ -8493,6 +8841,7 @@
     <w:p>
       <w:pPr>
         <w:pStyle w:val="Heading2"/>
+        <w:jc w:val="center"/>
       </w:pPr>
       <w:r>
         <w:t>Entropy is not just “messiness”</w:t>
@@ -8537,6 +8886,7 @@
     <w:p>
       <w:pPr>
         <w:pStyle w:val="Heading2"/>
+        <w:jc w:val="center"/>
       </w:pPr>
       <w:r>
         <w:t>The deck of cards</w:t>
@@ -8585,6 +8935,7 @@
     <w:p>
       <w:pPr>
         <w:pStyle w:val="Heading2"/>
+        <w:jc w:val="center"/>
       </w:pPr>
       <w:r>
         <w:t>Why the egg doesn’t unbreak itself</w:t>
@@ -8625,6 +8976,7 @@
     <w:p>
       <w:pPr>
         <w:pStyle w:val="Heading2"/>
+        <w:jc w:val="center"/>
       </w:pPr>
       <w:r>
         <w:lastRenderedPageBreak/>
@@ -8666,6 +9018,7 @@
     <w:p>
       <w:pPr>
         <w:pStyle w:val="Heading2"/>
+        <w:jc w:val="center"/>
       </w:pPr>
       <w:r>
         <w:t>The arrow of time</w:t>
@@ -8706,6 +9059,7 @@
     <w:p>
       <w:pPr>
         <w:pStyle w:val="Heading2"/>
+        <w:jc w:val="center"/>
       </w:pPr>
       <w:r>
         <w:lastRenderedPageBreak/>
@@ -8747,6 +9101,7 @@
     <w:p>
       <w:pPr>
         <w:pStyle w:val="Heading2"/>
+        <w:jc w:val="center"/>
       </w:pPr>
       <w:r>
         <w:t>The refrigerator cheat</w:t>
@@ -8788,6 +9143,7 @@
     <w:p>
       <w:pPr>
         <w:pStyle w:val="Heading2"/>
+        <w:jc w:val="center"/>
       </w:pPr>
       <w:r>
         <w:t>Life does not violate the second law</w:t>
@@ -8836,6 +9192,7 @@
     <w:p>
       <w:pPr>
         <w:pStyle w:val="Heading2"/>
+        <w:jc w:val="center"/>
       </w:pPr>
       <w:r>
         <w:t>Why we remember the past</w:t>
@@ -8868,6 +9225,7 @@
     <w:p>
       <w:pPr>
         <w:pStyle w:val="Heading2"/>
+        <w:jc w:val="center"/>
       </w:pPr>
       <w:r>
         <w:lastRenderedPageBreak/>
@@ -8909,6 +9267,7 @@
     <w:p>
       <w:pPr>
         <w:pStyle w:val="Heading2"/>
+        <w:jc w:val="center"/>
       </w:pPr>
       <w:r>
         <w:t>A thought experiment with two universes</w:t>
@@ -8941,6 +9300,7 @@
     <w:p>
       <w:pPr>
         <w:pStyle w:val="Heading2"/>
+        <w:jc w:val="center"/>
       </w:pPr>
       <w:r>
         <w:t xml:space="preserve">Reichenbach’s sharper question</w:t>
@@ -8969,6 +9329,7 @@
     <w:p>
       <w:pPr>
         <w:pStyle w:val="Heading2"/>
+        <w:jc w:val="center"/>
       </w:pPr>
       <w:r>
         <w:t>Branch systems</w:t>
@@ -9001,6 +9362,7 @@
     <w:p>
       <w:pPr>
         <w:pStyle w:val="Heading2"/>
+        <w:jc w:val="center"/>
       </w:pPr>
       <w:r>
         <w:t>Why the branches matter</w:t>
@@ -9037,6 +9399,7 @@
     <w:p>
       <w:pPr>
         <w:pStyle w:val="Heading2"/>
+        <w:jc w:val="center"/>
       </w:pPr>
       <w:r>
         <w:t>The arrow is not hidden inside every atom</w:t>
@@ -9069,6 +9432,7 @@
     <w:p>
       <w:pPr>
         <w:pStyle w:val="Heading2"/>
+        <w:jc w:val="center"/>
       </w:pPr>
       <w:r>
         <w:t xml:space="preserve">Records: photographs, fossils, footprints</w:t>
@@ -9093,6 +9457,7 @@
     <w:p>
       <w:pPr>
         <w:pStyle w:val="Heading2"/>
+        <w:jc w:val="center"/>
       </w:pPr>
       <w:r>
         <w:lastRenderedPageBreak/>
@@ -9126,6 +9491,7 @@
     <w:p>
       <w:pPr>
         <w:pStyle w:val="Heading2"/>
+        <w:jc w:val="center"/>
       </w:pPr>
       <w:r>
         <w:t>The common-cause principle</w:t>
@@ -9162,6 +9528,7 @@
     <w:p>
       <w:pPr>
         <w:pStyle w:val="Heading2"/>
+        <w:jc w:val="center"/>
       </w:pPr>
       <w:r>
         <w:t>Why the future does not leave records</w:t>
@@ -9186,6 +9553,7 @@
     <w:p>
       <w:pPr>
         <w:pStyle w:val="Heading2"/>
+        <w:jc w:val="center"/>
       </w:pPr>
       <w:r>
         <w:lastRenderedPageBreak/>
@@ -9219,6 +9587,7 @@
     <w:p>
       <w:pPr>
         <w:pStyle w:val="Heading2"/>
+        <w:jc w:val="center"/>
       </w:pPr>
       <w:r>
         <w:t>The universe as an entropy slope</w:t>
@@ -9243,6 +9612,7 @@
     <w:p>
       <w:pPr>
         <w:pStyle w:val="Heading2"/>
+        <w:jc w:val="center"/>
       </w:pPr>
       <w:r>
         <w:t>The subtle point: entropy does not simply define time</w:t>
@@ -9271,6 +9641,7 @@
     <w:p>
       <w:pPr>
         <w:pStyle w:val="Heading2"/>
+        <w:jc w:val="center"/>
       </w:pPr>
       <w:r>
         <w:t>The arrow is global, not merely local</w:t>
@@ -9295,6 +9666,7 @@
     <w:p>
       <w:pPr>
         <w:pStyle w:val="Heading2"/>
+        <w:jc w:val="center"/>
       </w:pPr>
       <w:r>
         <w:t>And now quantum mechanics enters</w:t>
@@ -9328,6 +9700,7 @@
     <w:p>
       <w:pPr>
         <w:pStyle w:val="Heading2"/>
+        <w:jc w:val="center"/>
       </w:pPr>
       <w:r>
         <w:t>Time reversal is not the same as running a movie backward</w:t>
@@ -9353,6 +9726,7 @@
     <w:p>
       <w:pPr>
         <w:pStyle w:val="Heading2"/>
+        <w:jc w:val="center"/>
       </w:pPr>
       <w:r>
         <w:t>The arrow may be a property of the universe’s state</w:t>
@@ -9377,6 +9751,7 @@
     <w:p>
       <w:pPr>
         <w:pStyle w:val="Heading2"/>
+        <w:jc w:val="center"/>
       </w:pPr>
       <w:r>
         <w:t>The egg, the photograph, and you</w:t>
@@ -9409,6 +9784,7 @@
     <w:p>
       <w:pPr>
         <w:pStyle w:val="Heading2"/>
+        <w:jc w:val="center"/>
       </w:pPr>
       <w:r>
         <w:t>What Reichenbach did not prove</w:t>
@@ -9437,6 +9813,7 @@
     <w:p>
       <w:pPr>
         <w:pStyle w:val="Heading2"/>
+        <w:jc w:val="center"/>
       </w:pPr>
       <w:r>
         <w:t xml:space="preserve">Time’s arrow, in summary</w:t>
@@ -9497,6 +9874,7 @@
     <w:p>
       <w:pPr>
         <w:pStyle w:val="Heading2"/>
+        <w:jc w:val="center"/>
       </w:pPr>
       <w:r>
         <w:t>One last cup of coffee</w:t>
@@ -9553,6 +9931,7 @@
     <w:p>
       <w:pPr>
         <w:pStyle w:val="Heading2"/>
+        <w:jc w:val="center"/>
       </w:pPr>
       <w:bookmarkStart w:id="1180" w:name="ex_ch13"/>
       <w:bookmarkEnd w:id="1180"/>
@@ -9663,7 +10042,12 @@
       </w:pPr>
       <w:r>
         <w:rPr>
+          <w:rFonts w:ascii="Amazon Ember" w:hAnsi="Amazon Ember" w:cs="Amazon Ember" w:eastAsia="Amazon Ember"/>
           <w:b/>
+          <w:bCs/>
+          <w:color w:val="0000FF"/>
+          <w:sz w:val="36"/>
+          <w:szCs w:val="36"/>
         </w:rPr>
         <w:t xml:space="preserve">Chapter 14</w:t>
       </w:r>
@@ -9671,6 +10055,7 @@
     <w:p>
       <w:pPr>
         <w:pStyle w:val="Heading1"/>
+        <w:jc w:val="center"/>
       </w:pPr>
       <w:bookmarkStart w:id="1163" w:name="ch06"/>
       <w:bookmarkEnd w:id="1163"/>
@@ -9740,6 +10125,7 @@
     </w:p>
     <w:p>
       <w:pPr>
+        <w:pageBreakBefore/>
         <w:jc w:val="both"/>
       </w:pPr>
       <w:r>
@@ -9766,6 +10152,7 @@
     <w:p>
       <w:pPr>
         <w:pStyle w:val="Heading2"/>
+        <w:jc w:val="center"/>
       </w:pPr>
       <w:r>
         <w:t>The clock on the wall</w:t>
@@ -9826,6 +10213,7 @@
     <w:p>
       <w:pPr>
         <w:pStyle w:val="Heading2"/>
+        <w:jc w:val="center"/>
       </w:pPr>
       <w:r>
         <w:t>The strange business of simultaneity</w:t>
@@ -9867,6 +10255,7 @@
     <w:p>
       <w:pPr>
         <w:pStyle w:val="Heading2"/>
+        <w:jc w:val="center"/>
       </w:pPr>
       <w:r>
         <w:t>The speed limit of the universe</w:t>
@@ -9916,6 +10305,7 @@
     <w:p>
       <w:pPr>
         <w:pStyle w:val="Heading2"/>
+        <w:jc w:val="center"/>
       </w:pPr>
       <w:r>
         <w:t>The moving clock</w:t>
@@ -10014,6 +10404,7 @@
     <w:p>
       <w:pPr>
         <w:pStyle w:val="Heading2"/>
+        <w:jc w:val="center"/>
       </w:pPr>
       <w:r>
         <w:lastRenderedPageBreak/>
@@ -10055,6 +10446,7 @@
     <w:p>
       <w:pPr>
         <w:pStyle w:val="Heading2"/>
+        <w:jc w:val="center"/>
       </w:pPr>
       <w:r>
         <w:t>Time is not a universal river</w:t>
@@ -10096,6 +10488,7 @@
     <w:p>
       <w:pPr>
         <w:pStyle w:val="Heading2"/>
+        <w:jc w:val="center"/>
       </w:pPr>
       <w:r>
         <w:t>So what is spacetime?</w:t>
@@ -10136,6 +10529,7 @@
     <w:p>
       <w:pPr>
         <w:pStyle w:val="Heading2"/>
+        <w:jc w:val="center"/>
       </w:pPr>
       <w:r>
         <w:t xml:space="preserve">Gravity joins in</w:t>
@@ -10164,6 +10558,7 @@
     <w:p>
       <w:pPr>
         <w:pStyle w:val="Heading2"/>
+        <w:jc w:val="center"/>
       </w:pPr>
       <w:r>
         <w:t>The light cone</w:t>
@@ -10247,6 +10642,7 @@
     <w:p>
       <w:pPr>
         <w:pStyle w:val="Heading2"/>
+        <w:jc w:val="center"/>
       </w:pPr>
       <w:r>
         <w:t>Time travel gets complicated</w:t>
@@ -10283,6 +10679,7 @@
     <w:p>
       <w:pPr>
         <w:pStyle w:val="Heading2"/>
+        <w:jc w:val="center"/>
       </w:pPr>
       <w:r>
         <w:t>A new picture of reality</w:t>
@@ -10323,6 +10720,7 @@
     <w:p>
       <w:pPr>
         <w:pStyle w:val="Heading2"/>
+        <w:jc w:val="center"/>
       </w:pPr>
       <w:r>
         <w:t>One last look at the clock</w:t>
@@ -10355,6 +10753,7 @@
     <w:p>
       <w:pPr>
         <w:pStyle w:val="Heading2"/>
+        <w:jc w:val="center"/>
       </w:pPr>
       <w:bookmarkStart w:id="1181" w:name="ex_ch14"/>
       <w:bookmarkEnd w:id="1181"/>
@@ -10451,7 +10850,12 @@
       </w:pPr>
       <w:r>
         <w:rPr>
+          <w:rFonts w:ascii="Amazon Ember" w:hAnsi="Amazon Ember" w:cs="Amazon Ember" w:eastAsia="Amazon Ember"/>
           <w:b/>
+          <w:bCs/>
+          <w:color w:val="0000FF"/>
+          <w:sz w:val="36"/>
+          <w:szCs w:val="36"/>
         </w:rPr>
         <w:t xml:space="preserve">Chapter 15</w:t>
       </w:r>
@@ -10459,6 +10863,7 @@
     <w:p>
       <w:pPr>
         <w:pStyle w:val="Heading1"/>
+        <w:jc w:val="center"/>
       </w:pPr>
       <w:bookmarkStart w:id="1164" w:name="ch06d"/>
       <w:bookmarkEnd w:id="1164"/>
@@ -10513,6 +10918,7 @@
     </w:p>
     <w:p>
       <w:pPr>
+        <w:pageBreakBefore/>
         <w:jc w:val="both"/>
       </w:pPr>
       <w:r>
@@ -10531,6 +10937,7 @@
     <w:p>
       <w:pPr>
         <w:pStyle w:val="Heading2"/>
+        <w:jc w:val="center"/>
       </w:pPr>
       <w:r>
         <w:t>The first clock was the sky itself</w:t>
@@ -10555,6 +10962,7 @@
     <w:p>
       <w:pPr>
         <w:pStyle w:val="Heading2"/>
+        <w:jc w:val="center"/>
       </w:pPr>
       <w:r>
         <w:t>Shadows, water, and sand</w:t>
@@ -10591,6 +10999,7 @@
     <w:p>
       <w:pPr>
         <w:pStyle w:val="Heading2"/>
+        <w:jc w:val="center"/>
       </w:pPr>
       <w:r>
         <w:t>The pendulum changes everything</w:t>
@@ -10619,6 +11028,7 @@
     <w:p>
       <w:pPr>
         <w:pStyle w:val="Heading2"/>
+        <w:jc w:val="center"/>
       </w:pPr>
       <w:r>
         <w:t>The problem pendulums could never solve</w:t>
@@ -10655,6 +11065,7 @@
     <w:p>
       <w:pPr>
         <w:pStyle w:val="Heading2"/>
+        <w:jc w:val="center"/>
       </w:pPr>
       <w:r>
         <w:t>Quartz: letting a crystal do the counting</w:t>
@@ -10683,6 +11094,7 @@
     <w:p>
       <w:pPr>
         <w:pStyle w:val="Heading2"/>
+        <w:jc w:val="center"/>
       </w:pPr>
       <w:r>
         <w:t>Atoms: the clock that changed the definition of the second</w:t>
@@ -10722,6 +11134,7 @@
     <w:p>
       <w:pPr>
         <w:pStyle w:val="Heading2"/>
+        <w:jc w:val="center"/>
       </w:pPr>
       <w:r>
         <w:t xml:space="preserve">Why this matters for relativity</w:t>
@@ -10746,6 +11159,7 @@
     <w:p>
       <w:pPr>
         <w:pStyle w:val="Heading2"/>
+        <w:jc w:val="center"/>
       </w:pPr>
       <w:r>
         <w:t xml:space="preserve">Summing Up</w:t>
@@ -10774,6 +11188,7 @@
     <w:p>
       <w:pPr>
         <w:pStyle w:val="Heading2"/>
+        <w:jc w:val="center"/>
       </w:pPr>
       <w:bookmarkStart w:id="1182" w:name="ex_ch15"/>
       <w:bookmarkEnd w:id="1182"/>
@@ -10870,7 +11285,12 @@
       </w:pPr>
       <w:r>
         <w:rPr>
+          <w:rFonts w:ascii="Amazon Ember" w:hAnsi="Amazon Ember" w:cs="Amazon Ember" w:eastAsia="Amazon Ember"/>
           <w:b/>
+          <w:bCs/>
+          <w:color w:val="0000FF"/>
+          <w:sz w:val="36"/>
+          <w:szCs w:val="36"/>
         </w:rPr>
         <w:t xml:space="preserve">Chapter 16</w:t>
       </w:r>
@@ -10878,6 +11298,7 @@
     <w:p>
       <w:pPr>
         <w:pStyle w:val="Heading1"/>
+        <w:jc w:val="center"/>
       </w:pPr>
       <w:bookmarkStart w:id="1165" w:name="ch07"/>
       <w:bookmarkEnd w:id="1165"/>
@@ -10951,6 +11372,7 @@
     <w:p>
       <w:pPr>
         <w:pStyle w:val="Heading2"/>
+        <w:jc w:val="center"/>
       </w:pPr>
       <w:r>
         <w:t>Thales, Pythagoras, and a very useful circle</w:t>
@@ -11008,6 +11430,7 @@
     <w:p>
       <w:pPr>
         <w:pStyle w:val="Heading2"/>
+        <w:jc w:val="center"/>
       </w:pPr>
       <w:r>
         <w:t>The light clock</w:t>
@@ -11060,6 +11483,7 @@
     <w:p>
       <w:pPr>
         <w:pStyle w:val="Heading2"/>
+        <w:jc w:val="center"/>
       </w:pPr>
       <w:r>
         <w:t>x is space, y is time</w:t>
@@ -11151,6 +11575,7 @@
     <w:p>
       <w:pPr>
         <w:pStyle w:val="Heading2"/>
+        <w:jc w:val="center"/>
       </w:pPr>
       <w:r>
         <w:t>Everything is moving through spacetime</w:t>
@@ -11203,6 +11628,7 @@
     <w:p>
       <w:pPr>
         <w:pStyle w:val="Heading2"/>
+        <w:jc w:val="center"/>
       </w:pPr>
       <w:r>
         <w:t>Why moving clocks run slow</w:t>
@@ -11243,6 +11669,7 @@
     <w:p>
       <w:pPr>
         <w:pStyle w:val="Heading2"/>
+        <w:jc w:val="center"/>
       </w:pPr>
       <w:r>
         <w:t>The speed of light is the limit</w:t>
@@ -11284,6 +11711,7 @@
     <w:p>
       <w:pPr>
         <w:pStyle w:val="Heading2"/>
+        <w:jc w:val="center"/>
       </w:pPr>
       <w:r>
         <w:t>The Thales circle becomes a spacetime picture</w:t>
@@ -11358,6 +11786,7 @@
     <w:p>
       <w:pPr>
         <w:pStyle w:val="Heading2"/>
+        <w:jc w:val="center"/>
       </w:pPr>
       <w:r>
         <w:t>Why different observers disagree</w:t>
@@ -11399,6 +11828,7 @@
     <w:p>
       <w:pPr>
         <w:pStyle w:val="Heading2"/>
+        <w:jc w:val="center"/>
       </w:pPr>
       <w:r>
         <w:t>The train and the lightning bolts</w:t>
@@ -11439,6 +11869,7 @@
     <w:p>
       <w:pPr>
         <w:pStyle w:val="Heading2"/>
+        <w:jc w:val="center"/>
       </w:pPr>
       <w:r>
         <w:t>A tiny bit of algebra</w:t>
@@ -11489,6 +11920,7 @@
     <w:p>
       <w:pPr>
         <w:pStyle w:val="Heading2"/>
+        <w:jc w:val="center"/>
       </w:pPr>
       <w:r>
         <w:t>The twin story</w:t>
@@ -11529,6 +11961,7 @@
     <w:p>
       <w:pPr>
         <w:pStyle w:val="Heading2"/>
+        <w:jc w:val="center"/>
       </w:pPr>
       <w:r>
         <w:t>You are not standing still</w:t>
@@ -11581,6 +12014,7 @@
     <w:p>
       <w:pPr>
         <w:pStyle w:val="Heading2"/>
+        <w:jc w:val="center"/>
       </w:pPr>
       <w:r>
         <w:t>What special relativity really changed</w:t>
@@ -11638,6 +12072,7 @@
     <w:p>
       <w:pPr>
         <w:pStyle w:val="Heading2"/>
+        <w:jc w:val="center"/>
       </w:pPr>
       <w:r>
         <w:t>One last picture</w:t>
@@ -11687,6 +12122,7 @@
     <w:p>
       <w:pPr>
         <w:pStyle w:val="Heading2"/>
+        <w:jc w:val="center"/>
       </w:pPr>
       <w:bookmarkStart w:id="1183" w:name="ex_ch16"/>
       <w:bookmarkEnd w:id="1183"/>
@@ -11797,7 +12233,12 @@
       </w:pPr>
       <w:r>
         <w:rPr>
+          <w:rFonts w:ascii="Amazon Ember" w:hAnsi="Amazon Ember" w:cs="Amazon Ember" w:eastAsia="Amazon Ember"/>
           <w:b/>
+          <w:bCs/>
+          <w:color w:val="0000FF"/>
+          <w:sz w:val="36"/>
+          <w:szCs w:val="36"/>
         </w:rPr>
         <w:t xml:space="preserve">Chapter 17</w:t>
       </w:r>
@@ -11805,6 +12246,7 @@
     <w:p>
       <w:pPr>
         <w:pStyle w:val="Heading1"/>
+        <w:jc w:val="center"/>
       </w:pPr>
       <w:bookmarkStart w:id="1166" w:name="ch06a"/>
       <w:bookmarkEnd w:id="1166"/>
@@ -11862,6 +12304,8 @@
     <w:p>
       <w:pPr>
         <w:pStyle w:val="Heading2"/>
+        <w:pageBreakBefore/>
+        <w:jc w:val="center"/>
       </w:pPr>
       <w:r>
         <w:t>The Most Annoying Question in Physics</w:t>
@@ -11907,6 +12351,7 @@
     <w:p>
       <w:pPr>
         <w:pStyle w:val="Heading2"/>
+        <w:jc w:val="center"/>
       </w:pPr>
       <w:r>
         <w:t>The river in your head</w:t>
@@ -11939,6 +12384,7 @@
     <w:p>
       <w:pPr>
         <w:pStyle w:val="Heading2"/>
+        <w:jc w:val="center"/>
       </w:pPr>
       <w:r>
         <w:t>Einstein makes the problem worse — in a wonderful way</w:t>
@@ -11963,6 +12409,7 @@
     <w:p>
       <w:pPr>
         <w:pStyle w:val="Heading2"/>
+        <w:jc w:val="center"/>
       </w:pPr>
       <w:r>
         <w:t>The block universe</w:t>
@@ -11991,6 +12438,7 @@
     <w:p>
       <w:pPr>
         <w:pStyle w:val="Heading2"/>
+        <w:jc w:val="center"/>
       </w:pPr>
       <w:r>
         <w:t>But surely the present is real!</w:t>
@@ -12015,6 +12463,7 @@
     <w:p>
       <w:pPr>
         <w:pStyle w:val="Heading2"/>
+        <w:jc w:val="center"/>
       </w:pPr>
       <w:r>
         <w:t>Barbour’s radical move</w:t>
@@ -12039,6 +12488,7 @@
     <w:p>
       <w:pPr>
         <w:pStyle w:val="Heading2"/>
+        <w:jc w:val="center"/>
       </w:pPr>
       <w:r>
         <w:t>The universe as a collection of “Nows”</w:t>
@@ -12063,6 +12513,7 @@
     <w:p>
       <w:pPr>
         <w:pStyle w:val="Heading2"/>
+        <w:jc w:val="center"/>
       </w:pPr>
       <w:r>
         <w:t xml:space="preserve">Records without a flowing past</w:t>
@@ -12095,6 +12546,7 @@
     <w:p>
       <w:pPr>
         <w:pStyle w:val="Heading2"/>
+        <w:jc w:val="center"/>
       </w:pPr>
       <w:r>
         <w:t>The movie illusion</w:t>
@@ -12127,6 +12579,7 @@
     <w:p>
       <w:pPr>
         <w:pStyle w:val="Heading2"/>
+        <w:jc w:val="center"/>
       </w:pPr>
       <w:r>
         <w:t>Change without time?</w:t>
@@ -12155,6 +12608,7 @@
     <w:p>
       <w:pPr>
         <w:pStyle w:val="Heading2"/>
+        <w:jc w:val="center"/>
       </w:pPr>
       <w:r>
         <w:t>Clocks do not create time</w:t>
@@ -12187,6 +12641,7 @@
     <w:p>
       <w:pPr>
         <w:pStyle w:val="Heading2"/>
+        <w:jc w:val="center"/>
       </w:pPr>
       <w:r>
         <w:t>Why clocks disagree</w:t>
@@ -12211,6 +12666,7 @@
     <w:p>
       <w:pPr>
         <w:pStyle w:val="Heading2"/>
+        <w:jc w:val="center"/>
       </w:pPr>
       <w:r>
         <w:t>Time may be like temperature</w:t>
@@ -12244,6 +12700,7 @@
     <w:p>
       <w:pPr>
         <w:pStyle w:val="Heading2"/>
+        <w:jc w:val="center"/>
       </w:pPr>
       <w:r>
         <w:t xml:space="preserve">Where the arrow fits</w:t>
@@ -12268,6 +12725,7 @@
     <w:p>
       <w:pPr>
         <w:pStyle w:val="Heading2"/>
+        <w:jc w:val="center"/>
       </w:pPr>
       <w:r>
         <w:t>What is a “moment” made of?</w:t>
@@ -12304,6 +12762,7 @@
     <w:p>
       <w:pPr>
         <w:pStyle w:val="Heading2"/>
+        <w:jc w:val="center"/>
       </w:pPr>
       <w:r>
         <w:t>The brain is a time machine</w:t>
@@ -12336,6 +12795,7 @@
     <w:p>
       <w:pPr>
         <w:pStyle w:val="Heading2"/>
+        <w:jc w:val="center"/>
       </w:pPr>
       <w:r>
         <w:t>Does this mean nothing ever happens?</w:t>
@@ -12368,6 +12828,7 @@
     <w:p>
       <w:pPr>
         <w:pStyle w:val="Heading2"/>
+        <w:jc w:val="center"/>
       </w:pPr>
       <w:r>
         <w:lastRenderedPageBreak/>
@@ -12393,6 +12854,7 @@
     <w:p>
       <w:pPr>
         <w:pStyle w:val="Heading2"/>
+        <w:jc w:val="center"/>
       </w:pPr>
       <w:r>
         <w:t>A dangerous but useful thought experiment</w:t>
@@ -12425,6 +12887,7 @@
     <w:p>
       <w:pPr>
         <w:pStyle w:val="Heading2"/>
+        <w:jc w:val="center"/>
       </w:pPr>
       <w:r>
         <w:t>Why this matters for quantum gravity</w:t>
@@ -12449,6 +12912,7 @@
     <w:p>
       <w:pPr>
         <w:pStyle w:val="Heading2"/>
+        <w:jc w:val="center"/>
       </w:pPr>
       <w:r>
         <w:t>The frozen universe is not as frozen as it sounds</w:t>
@@ -12481,6 +12945,7 @@
     <w:p>
       <w:pPr>
         <w:pStyle w:val="Heading2"/>
+        <w:jc w:val="center"/>
       </w:pPr>
       <w:r>
         <w:lastRenderedPageBreak/>
@@ -12522,6 +12987,7 @@
     <w:p>
       <w:pPr>
         <w:pStyle w:val="Heading2"/>
+        <w:jc w:val="center"/>
       </w:pPr>
       <w:r>
         <w:t xml:space="preserve">Barbour and Reichenbach together</w:t>
@@ -12546,6 +13012,7 @@
     <w:p>
       <w:pPr>
         <w:pStyle w:val="Heading2"/>
+        <w:jc w:val="center"/>
       </w:pPr>
       <w:r>
         <w:t>One final second</w:t>
@@ -12586,6 +13053,7 @@
     <w:p>
       <w:pPr>
         <w:pStyle w:val="Heading2"/>
+        <w:jc w:val="center"/>
       </w:pPr>
       <w:bookmarkStart w:id="1184" w:name="ex_ch17"/>
       <w:bookmarkEnd w:id="1184"/>
@@ -12682,7 +13150,12 @@
       </w:pPr>
       <w:r>
         <w:rPr>
+          <w:rFonts w:ascii="Amazon Ember" w:hAnsi="Amazon Ember" w:cs="Amazon Ember" w:eastAsia="Amazon Ember"/>
           <w:b/>
+          <w:bCs/>
+          <w:color w:val="0000FF"/>
+          <w:sz w:val="36"/>
+          <w:szCs w:val="36"/>
         </w:rPr>
         <w:t xml:space="preserve">Chapter 18</w:t>
       </w:r>
@@ -12690,6 +13163,7 @@
     <w:p>
       <w:pPr>
         <w:pStyle w:val="Heading1"/>
+        <w:jc w:val="center"/>
       </w:pPr>
       <w:bookmarkStart w:id="1167" w:name="ch35"/>
       <w:bookmarkEnd w:id="1167"/>
@@ -12745,6 +13219,8 @@
     <w:p>
       <w:pPr>
         <w:pStyle w:val="Heading2"/>
+        <w:pageBreakBefore/>
+        <w:jc w:val="center"/>
       </w:pPr>
       <w:r>
         <w:lastRenderedPageBreak/>
@@ -12778,6 +13254,7 @@
     <w:p>
       <w:pPr>
         <w:pStyle w:val="Heading2"/>
+        <w:jc w:val="center"/>
       </w:pPr>
       <w:r>
         <w:t>The Most Famous Limit</w:t>
@@ -12810,6 +13287,7 @@
     <w:p>
       <w:pPr>
         <w:pStyle w:val="Heading2"/>
+        <w:jc w:val="center"/>
       </w:pPr>
       <w:r>
         <w:t>But c Is More Than a Speed</w:t>
@@ -12851,6 +13329,7 @@
     <w:p>
       <w:pPr>
         <w:pStyle w:val="Heading2"/>
+        <w:jc w:val="center"/>
       </w:pPr>
       <w:r>
         <w:lastRenderedPageBreak/>
@@ -12876,6 +13355,7 @@
     <w:p>
       <w:pPr>
         <w:pStyle w:val="Heading2"/>
+        <w:jc w:val="center"/>
       </w:pPr>
       <w:r>
         <w:t>Build a Length From Three Constants</w:t>
@@ -12920,6 +13400,7 @@
     <w:p>
       <w:pPr>
         <w:pStyle w:val="Heading2"/>
+        <w:jc w:val="center"/>
       </w:pPr>
       <w:r>
         <w:t>The Planck Time</w:t>
@@ -12944,6 +13425,7 @@
     <w:p>
       <w:pPr>
         <w:pStyle w:val="Heading2"/>
+        <w:jc w:val="center"/>
       </w:pPr>
       <w:r>
         <w:t>Can Space Be Smaller Than That?</w:t>
@@ -12967,6 +13449,7 @@
     <w:p>
       <w:pPr>
         <w:pStyle w:val="Heading2"/>
+        <w:jc w:val="center"/>
       </w:pPr>
       <w:r>
         <w:t>The Universe Has a Gravitational Limit Too</w:t>
@@ -12991,6 +13474,7 @@
     <w:p>
       <w:pPr>
         <w:pStyle w:val="Heading2"/>
+        <w:jc w:val="center"/>
       </w:pPr>
       <w:r>
         <w:t>Black Holes Put a Limit on Information</w:t>
@@ -13027,6 +13511,7 @@
     <w:p>
       <w:pPr>
         <w:pStyle w:val="Heading2"/>
+        <w:jc w:val="center"/>
       </w:pPr>
       <w:r>
         <w:t>A Maximum Force?</w:t>
@@ -13064,6 +13549,7 @@
     <w:p>
       <w:pPr>
         <w:pStyle w:val="Heading2"/>
+        <w:jc w:val="center"/>
       </w:pPr>
       <w:r>
         <w:t>Thermodynamics Says: Not So Fast</w:t>
@@ -13088,6 +13574,7 @@
     <w:p>
       <w:pPr>
         <w:pStyle w:val="Heading2"/>
+        <w:jc w:val="center"/>
       </w:pPr>
       <w:r>
         <w:t>Information Has a Physical Price</w:t>
@@ -13132,6 +13619,7 @@
     <w:p>
       <w:pPr>
         <w:pStyle w:val="Heading2"/>
+        <w:jc w:val="center"/>
       </w:pPr>
       <w:r>
         <w:t>The Holographic Surprise</w:t>
@@ -13180,6 +13668,7 @@
     <w:p>
       <w:pPr>
         <w:pStyle w:val="Heading2"/>
+        <w:jc w:val="center"/>
       </w:pPr>
       <w:r>
         <w:lastRenderedPageBreak/>
@@ -13213,6 +13702,7 @@
     <w:p>
       <w:pPr>
         <w:pStyle w:val="Heading2"/>
+        <w:jc w:val="center"/>
       </w:pPr>
       <w:r>
         <w:t>Limits Are Clues, Not Walls</w:t>
@@ -13237,6 +13727,7 @@
     <w:p>
       <w:pPr>
         <w:pStyle w:val="Heading2"/>
+        <w:jc w:val="center"/>
       </w:pPr>
       <w:r>
         <w:t>A Dangerous Habit: Turning Numbers Into Myths</w:t>
@@ -13286,6 +13777,7 @@
     <w:p>
       <w:pPr>
         <w:pStyle w:val="Heading2"/>
+        <w:jc w:val="center"/>
       </w:pPr>
       <w:r>
         <w:t>What We Know, What We Suspect</w:t>
@@ -13314,6 +13806,7 @@
     <w:p>
       <w:pPr>
         <w:pStyle w:val="Heading2"/>
+        <w:jc w:val="center"/>
       </w:pPr>
       <w:r>
         <w:t>The Deeper Pattern</w:t>
@@ -13338,6 +13831,7 @@
     <w:p>
       <w:pPr>
         <w:pStyle w:val="Heading2"/>
+        <w:jc w:val="center"/>
       </w:pPr>
       <w:r>
         <w:t xml:space="preserve">Summing Up</w:t>
@@ -13370,6 +13864,7 @@
     <w:p>
       <w:pPr>
         <w:pStyle w:val="Heading2"/>
+        <w:jc w:val="center"/>
       </w:pPr>
       <w:bookmarkStart w:id="1185" w:name="ex_ch18"/>
       <w:bookmarkEnd w:id="1185"/>
@@ -13476,6 +13971,7 @@
       <w:pPr>
         <w:pStyle w:val="Heading1"/>
         <w:pageBreakBefore/>
+        <w:jc w:val="center"/>
       </w:pPr>
       <w:bookmarkStart w:id="141" w:name="_TocAll0002"/>
       <w:bookmarkEnd w:id="141"/>
@@ -13498,6 +13994,7 @@
     <w:p>
       <w:pPr>
         <w:pStyle w:val="Heading2"/>
+        <w:jc w:val="center"/>
       </w:pPr>
       <w:r>
         <w:t>The One Idea You Should Never Lose</w:t>
@@ -13522,6 +14019,7 @@
     <w:p>
       <w:pPr>
         <w:pStyle w:val="Heading2"/>
+        <w:jc w:val="center"/>
       </w:pPr>
       <w:r>
         <w:t>The Thales Circle of Relativity</w:t>
@@ -13546,6 +14044,7 @@
     <w:p>
       <w:pPr>
         <w:pStyle w:val="Heading2"/>
+        <w:jc w:val="center"/>
       </w:pPr>
       <w:r>
         <w:t>So Why Can’t We Go Faster Than Light?</w:t>
@@ -13570,6 +14069,7 @@
     <w:p>
       <w:pPr>
         <w:pStyle w:val="Heading2"/>
+        <w:jc w:val="center"/>
       </w:pPr>
       <w:r>
         <w:lastRenderedPageBreak/>
@@ -13595,6 +14095,7 @@
     <w:p>
       <w:pPr>
         <w:pStyle w:val="Heading2"/>
+        <w:jc w:val="center"/>
       </w:pPr>
       <w:r>
         <w:t>Time Is Part of the Motion</w:t>
@@ -13619,6 +14120,7 @@
     <w:p>
       <w:pPr>
         <w:pStyle w:val="Heading2"/>
+        <w:jc w:val="center"/>
       </w:pPr>
       <w:r>
         <w:t>The Universe Is Suspiciously Good at Keeping Accounts</w:t>
@@ -13655,6 +14157,7 @@
     <w:p>
       <w:pPr>
         <w:pStyle w:val="Heading2"/>
+        <w:jc w:val="center"/>
       </w:pPr>
       <w:r>
         <w:lastRenderedPageBreak/>
@@ -13680,6 +14183,7 @@
     <w:p>
       <w:pPr>
         <w:pStyle w:val="Heading2"/>
+        <w:jc w:val="center"/>
       </w:pPr>
       <w:r>
         <w:t>What This Volume Left Alone, on Purpose</w:t>
@@ -13704,6 +14208,7 @@
     <w:p>
       <w:pPr>
         <w:pStyle w:val="Heading2"/>
+        <w:jc w:val="center"/>
       </w:pPr>
       <w:r>
         <w:t>What We Still Don’t Know</w:t>
@@ -13729,6 +14234,7 @@
     <w:p>
       <w:pPr>
         <w:pStyle w:val="Heading2"/>
+        <w:jc w:val="center"/>
       </w:pPr>
       <w:r>
         <w:t>The Most Important Habit</w:t>
@@ -13753,6 +14259,7 @@
     <w:p>
       <w:pPr>
         <w:pStyle w:val="Heading2"/>
+        <w:jc w:val="center"/>
       </w:pPr>
       <w:r>
         <w:t>Five Things Worth Remembering</w:t>
@@ -13801,6 +14308,7 @@
     <w:p>
       <w:pPr>
         <w:pStyle w:val="Heading2"/>
+        <w:jc w:val="center"/>
       </w:pPr>
       <w:r>
         <w:t>And One Thing Not to Forget</w:t>
@@ -13829,6 +14337,7 @@
     <w:p>
       <w:pPr>
         <w:pStyle w:val="Heading2"/>
+        <w:jc w:val="center"/>
       </w:pPr>
       <w:r>
         <w:t xml:space="preserve">A Rule Worth Keeping</w:t>
@@ -13845,6 +14354,7 @@
     <w:p>
       <w:pPr>
         <w:pStyle w:val="Heading2"/>
+        <w:jc w:val="center"/>
       </w:pPr>
       <w:r>
         <w:t xml:space="preserve">The Whole Volume in One Paragraph</w:t>
@@ -13874,6 +14384,7 @@
     <w:p>
       <w:pPr>
         <w:pStyle w:val="Heading1"/>
+        <w:jc w:val="center"/>
       </w:pPr>
       <w:bookmarkStart w:id="1186" w:name="sol_all"/>
       <w:bookmarkEnd w:id="1186"/>
@@ -13892,6 +14403,7 @@
     <w:p>
       <w:pPr>
         <w:pStyle w:val="Heading2"/>
+        <w:jc w:val="center"/>
       </w:pPr>
       <w:bookmarkStart w:id="1187" w:name="sol_ch1"/>
       <w:bookmarkEnd w:id="1187"/>
@@ -14032,6 +14544,7 @@
     <w:p>
       <w:pPr>
         <w:pStyle w:val="Heading2"/>
+        <w:jc w:val="center"/>
       </w:pPr>
       <w:bookmarkStart w:id="1188" w:name="sol_ch2"/>
       <w:bookmarkEnd w:id="1188"/>
@@ -14172,6 +14685,7 @@
     <w:p>
       <w:pPr>
         <w:pStyle w:val="Heading2"/>
+        <w:jc w:val="center"/>
       </w:pPr>
       <w:bookmarkStart w:id="1189" w:name="sol_ch3"/>
       <w:bookmarkEnd w:id="1189"/>
@@ -14312,6 +14826,7 @@
     <w:p>
       <w:pPr>
         <w:pStyle w:val="Heading2"/>
+        <w:jc w:val="center"/>
       </w:pPr>
       <w:bookmarkStart w:id="1190" w:name="sol_ch4"/>
       <w:bookmarkEnd w:id="1190"/>
@@ -14452,6 +14967,7 @@
     <w:p>
       <w:pPr>
         <w:pStyle w:val="Heading2"/>
+        <w:jc w:val="center"/>
       </w:pPr>
       <w:bookmarkStart w:id="1191" w:name="sol_ch5"/>
       <w:bookmarkEnd w:id="1191"/>
@@ -14592,6 +15108,7 @@
     <w:p>
       <w:pPr>
         <w:pStyle w:val="Heading2"/>
+        <w:jc w:val="center"/>
       </w:pPr>
       <w:bookmarkStart w:id="1192" w:name="sol_ch6"/>
       <w:bookmarkEnd w:id="1192"/>
@@ -14732,6 +15249,7 @@
     <w:p>
       <w:pPr>
         <w:pStyle w:val="Heading2"/>
+        <w:jc w:val="center"/>
       </w:pPr>
       <w:bookmarkStart w:id="1193" w:name="sol_ch7"/>
       <w:bookmarkEnd w:id="1193"/>
@@ -14872,6 +15390,7 @@
     <w:p>
       <w:pPr>
         <w:pStyle w:val="Heading2"/>
+        <w:jc w:val="center"/>
       </w:pPr>
       <w:bookmarkStart w:id="1194" w:name="sol_ch8"/>
       <w:bookmarkEnd w:id="1194"/>
@@ -15012,6 +15531,7 @@
     <w:p>
       <w:pPr>
         <w:pStyle w:val="Heading2"/>
+        <w:jc w:val="center"/>
       </w:pPr>
       <w:bookmarkStart w:id="1195" w:name="sol_ch9"/>
       <w:bookmarkEnd w:id="1195"/>
@@ -15152,6 +15672,7 @@
     <w:p>
       <w:pPr>
         <w:pStyle w:val="Heading2"/>
+        <w:jc w:val="center"/>
       </w:pPr>
       <w:bookmarkStart w:id="1196" w:name="sol_ch10"/>
       <w:bookmarkEnd w:id="1196"/>
@@ -15292,6 +15813,7 @@
     <w:p>
       <w:pPr>
         <w:pStyle w:val="Heading2"/>
+        <w:jc w:val="center"/>
       </w:pPr>
       <w:bookmarkStart w:id="1197" w:name="sol_ch11"/>
       <w:bookmarkEnd w:id="1197"/>
@@ -15432,6 +15954,7 @@
     <w:p>
       <w:pPr>
         <w:pStyle w:val="Heading2"/>
+        <w:jc w:val="center"/>
       </w:pPr>
       <w:bookmarkStart w:id="1198" w:name="sol_ch12"/>
       <w:bookmarkEnd w:id="1198"/>
@@ -15572,6 +16095,7 @@
     <w:p>
       <w:pPr>
         <w:pStyle w:val="Heading2"/>
+        <w:jc w:val="center"/>
       </w:pPr>
       <w:bookmarkStart w:id="1199" w:name="sol_ch13"/>
       <w:bookmarkEnd w:id="1199"/>
@@ -15741,6 +16265,7 @@
     <w:p>
       <w:pPr>
         <w:pStyle w:val="Heading2"/>
+        <w:jc w:val="center"/>
       </w:pPr>
       <w:bookmarkStart w:id="1200" w:name="sol_ch14"/>
       <w:bookmarkEnd w:id="1200"/>
@@ -15881,6 +16406,7 @@
     <w:p>
       <w:pPr>
         <w:pStyle w:val="Heading2"/>
+        <w:jc w:val="center"/>
       </w:pPr>
       <w:bookmarkStart w:id="1201" w:name="sol_ch15"/>
       <w:bookmarkEnd w:id="1201"/>
@@ -16021,6 +16547,7 @@
     <w:p>
       <w:pPr>
         <w:pStyle w:val="Heading2"/>
+        <w:jc w:val="center"/>
       </w:pPr>
       <w:bookmarkStart w:id="1202" w:name="sol_ch16"/>
       <w:bookmarkEnd w:id="1202"/>
@@ -16190,6 +16717,7 @@
     <w:p>
       <w:pPr>
         <w:pStyle w:val="Heading2"/>
+        <w:jc w:val="center"/>
       </w:pPr>
       <w:bookmarkStart w:id="1203" w:name="sol_ch17"/>
       <w:bookmarkEnd w:id="1203"/>
@@ -16330,6 +16858,7 @@
     <w:p>
       <w:pPr>
         <w:pStyle w:val="Heading2"/>
+        <w:jc w:val="center"/>
       </w:pPr>
       <w:bookmarkStart w:id="1204" w:name="sol_ch18"/>
       <w:bookmarkEnd w:id="1204"/>
@@ -16504,6 +17033,7 @@
     <w:p>
       <w:pPr>
         <w:pStyle w:val="Heading1"/>
+        <w:jc w:val="center"/>
       </w:pPr>
       <w:bookmarkStart w:id="142" w:name="_TocAll0003"/>
       <w:bookmarkEnd w:id="142"/>
@@ -16967,6 +17497,7 @@
     <w:p>
       <w:pPr>
         <w:pStyle w:val="Heading1"/>
+        <w:jc w:val="center"/>
       </w:pPr>
       <w:bookmarkStart w:id="1205" w:name="src_all"/>
       <w:bookmarkEnd w:id="1205"/>
@@ -16985,6 +17516,7 @@
     <w:p>
       <w:pPr>
         <w:pStyle w:val="Heading2"/>
+        <w:jc w:val="center"/>
       </w:pPr>
       <w:r>
         <w:t xml:space="preserve">General textbooks and free references</w:t>
@@ -17085,6 +17617,7 @@
     <w:p>
       <w:pPr>
         <w:pStyle w:val="Heading2"/>
+        <w:jc w:val="center"/>
       </w:pPr>
       <w:r>
         <w:t xml:space="preserve">Chapters 1–8: motion, forces, energy, oscillations and waves</w:t>
@@ -17139,6 +17672,7 @@
     <w:p>
       <w:pPr>
         <w:pStyle w:val="Heading2"/>
+        <w:jc w:val="center"/>
       </w:pPr>
       <w:r>
         <w:t xml:space="preserve">Chapter 9: stationary action</w:t>
@@ -17216,6 +17750,7 @@
     <w:p>
       <w:pPr>
         <w:pStyle w:val="Heading2"/>
+        <w:jc w:val="center"/>
       </w:pPr>
       <w:r>
         <w:t xml:space="preserve">Chapters 10–12: electromagnetism, light and optics</w:t>
@@ -17512,6 +18047,7 @@
     <w:p>
       <w:pPr>
         <w:pStyle w:val="Heading2"/>
+        <w:jc w:val="center"/>
       </w:pPr>
       <w:r>
         <w:t xml:space="preserve">Chapter 13: the direction of time</w:t>
@@ -17589,6 +18125,7 @@
     <w:p>
       <w:pPr>
         <w:pStyle w:val="Heading2"/>
+        <w:jc w:val="center"/>
       </w:pPr>
       <w:r>
         <w:t xml:space="preserve">Chapters 14–16: clocks, time and special relativity</w:t>
@@ -17781,6 +18318,7 @@
     <w:p>
       <w:pPr>
         <w:pStyle w:val="Heading2"/>
+        <w:jc w:val="center"/>
       </w:pPr>
       <w:r>
         <w:t xml:space="preserve">Chapter 17: does time exist?</w:t>
@@ -17835,6 +18373,7 @@
     <w:p>
       <w:pPr>
         <w:pStyle w:val="Heading2"/>
+        <w:jc w:val="center"/>
       </w:pPr>
       <w:r>
         <w:t xml:space="preserve">Chapter 18: limits of nature</w:t>
@@ -17986,6 +18525,7 @@
     <w:p>
       <w:pPr>
         <w:pStyle w:val="Heading1"/>
+        <w:jc w:val="center"/>
       </w:pPr>
       <w:bookmarkStart w:id="1246" w:name="credits"/>
       <w:bookmarkEnd w:id="1246"/>
@@ -18006,13 +18546,21 @@
         <w:jc w:val="both"/>
       </w:pPr>
       <w:r>
+        <w:t>The Prologue and every chapter have an opening illustration or diagram. Chapter-opening cards state each chapter’s key idea and preview what follows.</w:t>
+      </w:r>
+    </w:p>
+    <w:p>
+      <w:pPr>
+        <w:jc w:val="both"/>
+      </w:pPr>
+      <w:r>
         <w:rPr>
           <w:b/>
         </w:rPr>
-        <w:t xml:space="preserve">Chapter-opening illustrations, Chapters 1–18: </w:t>
-      </w:r>
-      <w:r>
-        <w:t xml:space="preserve">one per chapter except Chapter 12, each with the chapter’s key idea and what it will explore.</w:t>
+        <w:t xml:space="preserve">Diagrams, Chapter 14: </w:t>
+      </w:r>
+      <w:r>
+        <w:t xml:space="preserve">the light clock seen at rest and in motion; the light cone, what an event can influence and be influenced by.</w:t>
       </w:r>
     </w:p>
     <w:p>
@@ -18023,20 +18571,6 @@
         <w:rPr>
           <w:b/>
         </w:rPr>
-        <w:t xml:space="preserve">Diagrams, Chapter 14: </w:t>
-      </w:r>
-      <w:r>
-        <w:t xml:space="preserve">the light clock seen at rest and in motion; the light cone, what an event can influence and be influenced by.</w:t>
-      </w:r>
-    </w:p>
-    <w:p>
-      <w:pPr>
-        <w:jc w:val="both"/>
-      </w:pPr>
-      <w:r>
-        <w:rPr>
-          <w:b/>
-        </w:rPr>
         <w:t xml:space="preserve">Diagram, Chapter 16: </w:t>
       </w:r>
       <w:r>
@@ -18051,6 +18585,7 @@
     <w:p>
       <w:pPr>
         <w:pStyle w:val="Heading1"/>
+        <w:jc w:val="center"/>
       </w:pPr>
       <w:bookmarkStart w:id="143" w:name="_TocAll0004"/>
       <w:bookmarkEnd w:id="143"/>
@@ -18077,6 +18612,7 @@
     <w:p>
       <w:pPr>
         <w:pStyle w:val="Heading1"/>
+        <w:jc w:val="center"/>
       </w:pPr>
       <w:bookmarkStart w:id="144" w:name="_TocAll0005"/>
       <w:bookmarkEnd w:id="144"/>
@@ -18714,6 +19250,7 @@
     <w:p>
       <w:pPr>
         <w:pStyle w:val="Heading1"/>
+        <w:jc w:val="center"/>
       </w:pPr>
       <w:bookmarkStart w:id="145" w:name="_TocAll0006"/>
       <w:bookmarkEnd w:id="145"/>
@@ -19538,15 +20075,16 @@
       <w:keepNext/>
       <w:keepLines/>
       <w:spacing w:before="480" w:after="0"/>
+      <w:jc w:val="center"/>
       <w:outlineLvl w:val="0"/>
     </w:pPr>
     <w:rPr>
-      <w:rFonts w:asciiTheme="majorHAnsi" w:eastAsiaTheme="majorEastAsia" w:hAnsiTheme="majorHAnsi" w:cstheme="majorBidi"/>
+      <w:rFonts w:ascii="Amazon Ember" w:hAnsi="Amazon Ember" w:cs="Amazon Ember" w:eastAsia="Amazon Ember"/>
       <w:b/>
       <w:bCs/>
       <w:color w:val="0000FF"/>
       <w:sz w:val="36"/>
-      <w:szCs w:val="28"/>
+      <w:szCs w:val="36"/>
     </w:rPr>
   </w:style>
   <w:style w:type="paragraph" w:styleId="Heading2">
@@ -19562,15 +20100,16 @@
       <w:keepNext/>
       <w:keepLines/>
       <w:spacing w:before="200" w:after="0"/>
+      <w:jc w:val="center"/>
       <w:outlineLvl w:val="1"/>
     </w:pPr>
     <w:rPr>
-      <w:rFonts w:asciiTheme="majorHAnsi" w:eastAsiaTheme="majorEastAsia" w:hAnsiTheme="majorHAnsi" w:cstheme="majorBidi"/>
+      <w:rFonts w:ascii="Amazon Ember" w:hAnsi="Amazon Ember" w:cs="Amazon Ember" w:eastAsia="Amazon Ember"/>
       <w:b/>
       <w:bCs/>
       <w:color w:val="0000FF"/>
       <w:sz w:val="36"/>
-      <w:szCs w:val="26"/>
+      <w:szCs w:val="36"/>
     </w:rPr>
   </w:style>
   <w:style w:type="paragraph" w:styleId="Heading3">

</xml_diff>